<commit_message>
minor reduction in exp2 instruction guide; finalize initial workshop docx files
</commit_message>
<xml_diff>
--- a/20_experiments/80_workshop/e1/s1/workshop1-1.docx
+++ b/20_experiments/80_workshop/e1/s1/workshop1-1.docx
@@ -20,10 +20,16 @@
         <w:pStyle w:val="FirstParagraph"/>
         <w:bidi w:val="0"/>
         <w:jc w:val="start"/>
-        <w:rPr/>
-      </w:pPr>
-      <w:r>
-        <w:rPr/>
+        <w:rPr>
+          <w:sz w:val="22"/>
+          <w:szCs w:val="22"/>
+        </w:rPr>
+      </w:pPr>
+      <w:r>
+        <w:rPr>
+          <w:sz w:val="22"/>
+          <w:szCs w:val="22"/>
+        </w:rPr>
         <w:t>Dieses Experiment testet die Qualität von automatisiert-generierten Fragen durch vier Large Language Models (LLMs) und deren Fähigkeit, sich an gegebene Quellinhalte zu halten. Dabei wurde ein einheitliches Promptdesign pro Fragetyp (Multiple-Choice, Open-Ended) verwendet, mit dem die Modelle Fragen zum ISO-OSI-Modell generieren sollten. Details zum Prompt werden aufgrund des Blindtests nicht gegeben.</w:t>
       </w:r>
     </w:p>
@@ -44,17 +50,25 @@
         <w:pStyle w:val="FirstParagraph"/>
         <w:bidi w:val="0"/>
         <w:jc w:val="start"/>
-        <w:rPr/>
+        <w:rPr>
+          <w:sz w:val="22"/>
+          <w:szCs w:val="22"/>
+        </w:rPr>
       </w:pPr>
       <w:r>
         <w:rPr>
           <w:b/>
           <w:bCs/>
+          <w:sz w:val="22"/>
+          <w:szCs w:val="22"/>
         </w:rPr>
         <w:t>Eingabequelle:</w:t>
       </w:r>
       <w:r>
-        <w:rPr/>
+        <w:rPr>
+          <w:sz w:val="22"/>
+          <w:szCs w:val="22"/>
+        </w:rPr>
         <w:t xml:space="preserve"> Extrahierte Textauszüge aus Prof. Caps Vorlesungs-PDF “Referenzarchitekturen” zum ISO-OSI-Modell</w:t>
       </w:r>
     </w:p>
@@ -63,12 +77,17 @@
         <w:pStyle w:val="BodyText"/>
         <w:bidi w:val="0"/>
         <w:jc w:val="start"/>
-        <w:rPr/>
+        <w:rPr>
+          <w:sz w:val="22"/>
+          <w:szCs w:val="22"/>
+        </w:rPr>
       </w:pPr>
       <w:r>
         <w:rPr>
           <w:b/>
           <w:bCs/>
+          <w:sz w:val="22"/>
+          <w:szCs w:val="22"/>
         </w:rPr>
         <w:t>Material-Aufbereitung:</w:t>
       </w:r>
@@ -82,10 +101,16 @@
         </w:numPr>
         <w:bidi w:val="0"/>
         <w:jc w:val="start"/>
-        <w:rPr/>
-      </w:pPr>
-      <w:r>
-        <w:rPr/>
+        <w:rPr>
+          <w:sz w:val="22"/>
+          <w:szCs w:val="22"/>
+        </w:rPr>
+      </w:pPr>
+      <w:r>
+        <w:rPr>
+          <w:sz w:val="22"/>
+          <w:szCs w:val="22"/>
+        </w:rPr>
         <w:t>Aufteilung in 7 einzelne TXT-Files (Layer 1-7)</w:t>
       </w:r>
     </w:p>
@@ -98,10 +123,16 @@
         </w:numPr>
         <w:bidi w:val="0"/>
         <w:jc w:val="start"/>
-        <w:rPr/>
-      </w:pPr>
-      <w:r>
-        <w:rPr/>
+        <w:rPr>
+          <w:sz w:val="22"/>
+          <w:szCs w:val="22"/>
+        </w:rPr>
+      </w:pPr>
+      <w:r>
+        <w:rPr>
+          <w:sz w:val="22"/>
+          <w:szCs w:val="22"/>
+        </w:rPr>
         <w:t>Bei Fragengenerierung wurde zum schnellen Nachvollziehen nachträglich der jeweilige Layer-Text in das Frage-File geschrieben</w:t>
       </w:r>
     </w:p>
@@ -110,12 +141,17 @@
         <w:pStyle w:val="FirstParagraph"/>
         <w:bidi w:val="0"/>
         <w:jc w:val="start"/>
-        <w:rPr/>
+        <w:rPr>
+          <w:sz w:val="22"/>
+          <w:szCs w:val="22"/>
+        </w:rPr>
       </w:pPr>
       <w:r>
         <w:rPr>
           <w:b/>
           <w:bCs/>
+          <w:sz w:val="22"/>
+          <w:szCs w:val="22"/>
         </w:rPr>
         <w:t>Generierte Fragen:</w:t>
       </w:r>
@@ -125,21 +161,32 @@
         <w:pStyle w:val="BodyText"/>
         <w:bidi w:val="0"/>
         <w:jc w:val="start"/>
-        <w:rPr/>
-      </w:pPr>
-      <w:r>
-        <w:rPr/>
+        <w:rPr>
+          <w:sz w:val="22"/>
+          <w:szCs w:val="22"/>
+        </w:rPr>
+      </w:pPr>
+      <w:r>
+        <w:rPr>
+          <w:sz w:val="22"/>
+          <w:szCs w:val="22"/>
+        </w:rPr>
         <w:t xml:space="preserve">Vorabinformation: Zur Steuerung der kognitiven Anforderung wurden in die Prompts für alle 4 LLMs bei jedem Lauf ein gemeinsames, randomisiertes Bloom-Level integriert, siehe </w:t>
       </w:r>
       <w:r>
         <w:rPr>
           <w:b/>
           <w:bCs/>
+          <w:sz w:val="22"/>
+          <w:szCs w:val="22"/>
         </w:rPr>
         <w:t>Bloom’s revised Taxonomy</w:t>
       </w:r>
       <w:r>
-        <w:rPr/>
+        <w:rPr>
+          <w:sz w:val="22"/>
+          <w:szCs w:val="22"/>
+        </w:rPr>
         <w:t xml:space="preserve"> mit 6 Stufen.</w:t>
       </w:r>
     </w:p>
@@ -148,21 +195,32 @@
         <w:pStyle w:val="BodyText"/>
         <w:bidi w:val="0"/>
         <w:jc w:val="start"/>
-        <w:rPr/>
-      </w:pPr>
-      <w:r>
-        <w:rPr/>
+        <w:rPr>
+          <w:sz w:val="22"/>
+          <w:szCs w:val="22"/>
+        </w:rPr>
+      </w:pPr>
+      <w:r>
+        <w:rPr>
+          <w:sz w:val="22"/>
+          <w:szCs w:val="22"/>
+        </w:rPr>
         <w:t xml:space="preserve">Zudem hat jede Frage ein bestimmtes Lernziel, basierend auf dem jeweiligen OSI-Layer (1/7), zu erfüllen. Das Einhalten dessen soll mit der </w:t>
       </w:r>
       <w:r>
         <w:rPr>
           <w:b/>
           <w:bCs/>
+          <w:sz w:val="22"/>
+          <w:szCs w:val="22"/>
         </w:rPr>
         <w:t>Wertigkeit</w:t>
       </w:r>
       <w:r>
-        <w:rPr/>
+        <w:rPr>
+          <w:sz w:val="22"/>
+          <w:szCs w:val="22"/>
+        </w:rPr>
         <w:t>-Kategorie in der Rubrik bewertet werden.</w:t>
       </w:r>
     </w:p>
@@ -175,10 +233,16 @@
         </w:numPr>
         <w:bidi w:val="0"/>
         <w:jc w:val="start"/>
-        <w:rPr/>
-      </w:pPr>
-      <w:r>
-        <w:rPr/>
+        <w:rPr>
+          <w:sz w:val="22"/>
+          <w:szCs w:val="22"/>
+        </w:rPr>
+      </w:pPr>
+      <w:r>
+        <w:rPr>
+          <w:sz w:val="22"/>
+          <w:szCs w:val="22"/>
+        </w:rPr>
         <w:t>4 LLMs × 7 Layer × 2 Fragetypen = 56 Fragen gesamt</w:t>
       </w:r>
     </w:p>
@@ -191,10 +255,16 @@
         </w:numPr>
         <w:bidi w:val="0"/>
         <w:jc w:val="start"/>
-        <w:rPr/>
-      </w:pPr>
-      <w:r>
-        <w:rPr/>
+        <w:rPr>
+          <w:sz w:val="22"/>
+          <w:szCs w:val="22"/>
+        </w:rPr>
+      </w:pPr>
+      <w:r>
+        <w:rPr>
+          <w:sz w:val="22"/>
+          <w:szCs w:val="22"/>
+        </w:rPr>
         <w:t>Pro LLM: 7 Multiple-Choice + 7 Open-Ended Fragen</w:t>
       </w:r>
     </w:p>
@@ -207,10 +277,16 @@
         </w:numPr>
         <w:bidi w:val="0"/>
         <w:jc w:val="start"/>
-        <w:rPr/>
-      </w:pPr>
-      <w:r>
-        <w:rPr/>
+        <w:rPr>
+          <w:sz w:val="22"/>
+          <w:szCs w:val="22"/>
+        </w:rPr>
+      </w:pPr>
+      <w:r>
+        <w:rPr>
+          <w:sz w:val="22"/>
+          <w:szCs w:val="22"/>
+        </w:rPr>
         <w:t>Random Bloom-Level pro Frage (Bloom 1-6 für Open-Ended, Bloom 1-3 für MCQ)</w:t>
       </w:r>
     </w:p>
@@ -223,11 +299,17 @@
         </w:numPr>
         <w:bidi w:val="0"/>
         <w:jc w:val="start"/>
-        <w:rPr/>
+        <w:rPr>
+          <w:sz w:val="22"/>
+          <w:szCs w:val="22"/>
+        </w:rPr>
       </w:pPr>
       <w:bookmarkStart w:id="0" w:name="experimentaufbau"/>
       <w:r>
-        <w:rPr/>
+        <w:rPr>
+          <w:sz w:val="22"/>
+          <w:szCs w:val="22"/>
+        </w:rPr>
         <w:t>Sample für Bewertung: 24 Fragen (6 pro LLM: 3 MCQ + 3 Open-Ended)</w:t>
       </w:r>
       <w:bookmarkEnd w:id="0"/>
@@ -265,22 +347,47 @@
         <w:rPr/>
       </w:pPr>
       <w:r>
-        <w:rPr/>
+        <w:rPr>
+          <w:sz w:val="22"/>
+          <w:szCs w:val="22"/>
+        </w:rPr>
         <w:t xml:space="preserve">Lesen Sie die Rubrik </w:t>
       </w:r>
       <w:r>
         <w:rPr>
           <w:rStyle w:val="VerbatimChar"/>
+          <w:sz w:val="22"/>
+          <w:szCs w:val="22"/>
         </w:rPr>
         <w:t>exp1_rubric.md</w:t>
       </w:r>
       <w:r>
-        <w:rPr/>
+        <w:rPr>
+          <w:sz w:val="22"/>
+          <w:szCs w:val="22"/>
+        </w:rPr>
         <w:t>, die folgende Kategorien umfasst (jeweils 1-5 Punkte):</w:t>
       </w:r>
     </w:p>
     <w:p>
       <w:pPr>
+        <w:pStyle w:val="BodyText"/>
+        <w:bidi w:val="0"/>
+        <w:jc w:val="start"/>
+        <w:rPr>
+          <w:sz w:val="22"/>
+          <w:szCs w:val="22"/>
+        </w:rPr>
+      </w:pPr>
+      <w:r>
+        <w:rPr>
+          <w:sz w:val="22"/>
+          <w:szCs w:val="22"/>
+        </w:rPr>
+      </w:r>
+    </w:p>
+    <w:p>
+      <w:pPr>
         <w:pStyle w:val="Compact"/>
         <w:numPr>
           <w:ilvl w:val="0"/>
@@ -288,17 +395,25 @@
         </w:numPr>
         <w:bidi w:val="0"/>
         <w:jc w:val="start"/>
-        <w:rPr/>
+        <w:rPr>
+          <w:sz w:val="22"/>
+          <w:szCs w:val="22"/>
+        </w:rPr>
       </w:pPr>
       <w:r>
         <w:rPr>
           <w:b/>
           <w:bCs/>
+          <w:sz w:val="22"/>
+          <w:szCs w:val="22"/>
         </w:rPr>
         <w:t>Relevanz:</w:t>
       </w:r>
       <w:r>
-        <w:rPr/>
+        <w:rPr>
+          <w:sz w:val="22"/>
+          <w:szCs w:val="22"/>
+        </w:rPr>
         <w:t xml:space="preserve"> Bezug zum Thema des Textinhalts</w:t>
       </w:r>
     </w:p>
@@ -311,17 +426,25 @@
         </w:numPr>
         <w:bidi w:val="0"/>
         <w:jc w:val="start"/>
-        <w:rPr/>
+        <w:rPr>
+          <w:sz w:val="22"/>
+          <w:szCs w:val="22"/>
+        </w:rPr>
       </w:pPr>
       <w:r>
         <w:rPr>
           <w:b/>
           <w:bCs/>
+          <w:sz w:val="22"/>
+          <w:szCs w:val="22"/>
         </w:rPr>
         <w:t>Klarheit:</w:t>
       </w:r>
       <w:r>
-        <w:rPr/>
+        <w:rPr>
+          <w:sz w:val="22"/>
+          <w:szCs w:val="22"/>
+        </w:rPr>
         <w:t xml:space="preserve"> Eindeutigkeit der Formulierung</w:t>
       </w:r>
     </w:p>
@@ -334,17 +457,25 @@
         </w:numPr>
         <w:bidi w:val="0"/>
         <w:jc w:val="start"/>
-        <w:rPr/>
+        <w:rPr>
+          <w:sz w:val="22"/>
+          <w:szCs w:val="22"/>
+        </w:rPr>
       </w:pPr>
       <w:r>
         <w:rPr>
           <w:b/>
           <w:bCs/>
+          <w:sz w:val="22"/>
+          <w:szCs w:val="22"/>
         </w:rPr>
         <w:t>Beantwortbarkeit:</w:t>
       </w:r>
       <w:r>
-        <w:rPr/>
+        <w:rPr>
+          <w:sz w:val="22"/>
+          <w:szCs w:val="22"/>
+        </w:rPr>
         <w:t xml:space="preserve"> Verfügbarkeit der Informationen im Text</w:t>
       </w:r>
     </w:p>
@@ -357,17 +488,25 @@
         </w:numPr>
         <w:bidi w:val="0"/>
         <w:jc w:val="start"/>
-        <w:rPr/>
+        <w:rPr>
+          <w:sz w:val="22"/>
+          <w:szCs w:val="22"/>
+        </w:rPr>
       </w:pPr>
       <w:r>
         <w:rPr>
           <w:b/>
           <w:bCs/>
+          <w:sz w:val="22"/>
+          <w:szCs w:val="22"/>
         </w:rPr>
         <w:t>Herausforderung:</w:t>
       </w:r>
       <w:r>
-        <w:rPr/>
+        <w:rPr>
+          <w:sz w:val="22"/>
+          <w:szCs w:val="22"/>
+        </w:rPr>
         <w:t xml:space="preserve"> Anspruchsniveau der Frage</w:t>
       </w:r>
     </w:p>
@@ -380,17 +519,25 @@
         </w:numPr>
         <w:bidi w:val="0"/>
         <w:jc w:val="start"/>
-        <w:rPr/>
+        <w:rPr>
+          <w:sz w:val="22"/>
+          <w:szCs w:val="22"/>
+        </w:rPr>
       </w:pPr>
       <w:r>
         <w:rPr>
           <w:b/>
           <w:bCs/>
+          <w:sz w:val="22"/>
+          <w:szCs w:val="22"/>
         </w:rPr>
         <w:t>Wertigkeit:</w:t>
       </w:r>
       <w:r>
-        <w:rPr/>
+        <w:rPr>
+          <w:sz w:val="22"/>
+          <w:szCs w:val="22"/>
+        </w:rPr>
         <w:t xml:space="preserve"> Bedeutung für vorgegebenes Lernziel</w:t>
       </w:r>
     </w:p>
@@ -403,17 +550,25 @@
         </w:numPr>
         <w:bidi w:val="0"/>
         <w:jc w:val="start"/>
-        <w:rPr/>
+        <w:rPr>
+          <w:sz w:val="22"/>
+          <w:szCs w:val="22"/>
+        </w:rPr>
       </w:pPr>
       <w:r>
         <w:rPr>
           <w:b/>
           <w:bCs/>
+          <w:sz w:val="22"/>
+          <w:szCs w:val="22"/>
         </w:rPr>
         <w:t>Sprachqualität:</w:t>
       </w:r>
       <w:r>
-        <w:rPr/>
+        <w:rPr>
+          <w:sz w:val="22"/>
+          <w:szCs w:val="22"/>
+        </w:rPr>
         <w:t xml:space="preserve"> Verständlichkeit und Angemessenheit</w:t>
       </w:r>
     </w:p>
@@ -426,17 +581,25 @@
         </w:numPr>
         <w:bidi w:val="0"/>
         <w:jc w:val="start"/>
-        <w:rPr/>
+        <w:rPr>
+          <w:sz w:val="22"/>
+          <w:szCs w:val="22"/>
+        </w:rPr>
       </w:pPr>
       <w:r>
         <w:rPr>
           <w:b/>
           <w:bCs/>
+          <w:sz w:val="22"/>
+          <w:szCs w:val="22"/>
         </w:rPr>
         <w:t>Korrektheit:</w:t>
       </w:r>
       <w:r>
-        <w:rPr/>
+        <w:rPr>
+          <w:sz w:val="22"/>
+          <w:szCs w:val="22"/>
+        </w:rPr>
         <w:t xml:space="preserve"> Fachliche Richtigkeit bezogen auf den Text, gemessen als Inhaltstreue zur Quelle</w:t>
       </w:r>
       <w:bookmarkEnd w:id="1"/>
@@ -462,17 +625,25 @@
         <w:rPr/>
       </w:pPr>
       <w:r>
-        <w:rPr/>
+        <w:rPr>
+          <w:sz w:val="22"/>
+          <w:szCs w:val="22"/>
+        </w:rPr>
         <w:t xml:space="preserve">Die Datei </w:t>
       </w:r>
       <w:r>
         <w:rPr>
           <w:rStyle w:val="VerbatimChar"/>
+          <w:sz w:val="22"/>
+          <w:szCs w:val="22"/>
         </w:rPr>
         <w:t>exp1.csv</w:t>
       </w:r>
       <w:r>
-        <w:rPr/>
+        <w:rPr>
+          <w:sz w:val="22"/>
+          <w:szCs w:val="22"/>
+        </w:rPr>
         <w:t xml:space="preserve"> enthält:</w:t>
       </w:r>
     </w:p>
@@ -490,11 +661,16 @@
       <w:r>
         <w:rPr>
           <w:rStyle w:val="VerbatimChar"/>
+          <w:sz w:val="22"/>
+          <w:szCs w:val="22"/>
         </w:rPr>
         <w:t>sample_id</w:t>
       </w:r>
       <w:r>
-        <w:rPr/>
+        <w:rPr>
+          <w:sz w:val="22"/>
+          <w:szCs w:val="22"/>
+        </w:rPr>
         <w:t>: Eindeutige ID (001-024) für Zuordnung zur Fragendatei</w:t>
       </w:r>
     </w:p>
@@ -512,11 +688,16 @@
       <w:r>
         <w:rPr>
           <w:rStyle w:val="VerbatimChar"/>
+          <w:sz w:val="22"/>
+          <w:szCs w:val="22"/>
         </w:rPr>
         <w:t>layer</w:t>
       </w:r>
       <w:r>
-        <w:rPr/>
+        <w:rPr>
+          <w:sz w:val="22"/>
+          <w:szCs w:val="22"/>
+        </w:rPr>
         <w:t>: OSI-Layer (1-7), aus dem die Frage generiert wurde</w:t>
       </w:r>
     </w:p>
@@ -534,26 +715,38 @@
       <w:r>
         <w:rPr>
           <w:rStyle w:val="VerbatimChar"/>
+          <w:sz w:val="22"/>
+          <w:szCs w:val="22"/>
         </w:rPr>
         <w:t>question_type</w:t>
       </w:r>
       <w:r>
-        <w:rPr/>
+        <w:rPr>
+          <w:sz w:val="22"/>
+          <w:szCs w:val="22"/>
+        </w:rPr>
         <w:t xml:space="preserve">: </w:t>
       </w:r>
       <w:r>
         <w:rPr>
           <w:rStyle w:val="VerbatimChar"/>
+          <w:sz w:val="22"/>
+          <w:szCs w:val="22"/>
         </w:rPr>
         <w:t>mcq</w:t>
       </w:r>
       <w:r>
-        <w:rPr/>
+        <w:rPr>
+          <w:sz w:val="22"/>
+          <w:szCs w:val="22"/>
+        </w:rPr>
         <w:t xml:space="preserve"> oder </w:t>
       </w:r>
       <w:r>
         <w:rPr>
           <w:rStyle w:val="VerbatimChar"/>
+          <w:sz w:val="22"/>
+          <w:szCs w:val="22"/>
         </w:rPr>
         <w:t>open_ended</w:t>
       </w:r>
@@ -567,10 +760,16 @@
         </w:numPr>
         <w:bidi w:val="0"/>
         <w:jc w:val="start"/>
-        <w:rPr/>
-      </w:pPr>
-      <w:r>
-        <w:rPr/>
+        <w:rPr>
+          <w:sz w:val="22"/>
+          <w:szCs w:val="22"/>
+        </w:rPr>
+      </w:pPr>
+      <w:r>
+        <w:rPr>
+          <w:sz w:val="22"/>
+          <w:szCs w:val="22"/>
+        </w:rPr>
         <w:t>Die 7 Bewertungsspalten aus Schritt 1 (1-5 Punkte)</w:t>
       </w:r>
     </w:p>
@@ -588,11 +787,16 @@
       <w:r>
         <w:rPr>
           <w:rStyle w:val="VerbatimChar"/>
+          <w:sz w:val="22"/>
+          <w:szCs w:val="22"/>
         </w:rPr>
         <w:t>answer_problems</w:t>
       </w:r>
       <w:r>
-        <w:rPr/>
+        <w:rPr>
+          <w:sz w:val="22"/>
+          <w:szCs w:val="22"/>
+        </w:rPr>
         <w:t>: Für problematische Antworten</w:t>
       </w:r>
     </w:p>
@@ -610,11 +814,16 @@
       <w:r>
         <w:rPr>
           <w:rStyle w:val="VerbatimChar"/>
+          <w:sz w:val="22"/>
+          <w:szCs w:val="22"/>
         </w:rPr>
         <w:t>comments</w:t>
       </w:r>
       <w:r>
-        <w:rPr/>
+        <w:rPr>
+          <w:sz w:val="22"/>
+          <w:szCs w:val="22"/>
+        </w:rPr>
         <w:t>: Für zusätzliche Anmerkungen</w:t>
       </w:r>
       <w:bookmarkEnd w:id="2"/>
@@ -643,12 +852,17 @@
         <w:rPr/>
       </w:pPr>
       <w:r>
-        <w:rPr/>
+        <w:rPr>
+          <w:sz w:val="22"/>
+          <w:szCs w:val="22"/>
+        </w:rPr>
         <w:t xml:space="preserve">Öffnen Sie </w:t>
       </w:r>
       <w:r>
         <w:rPr>
           <w:rStyle w:val="VerbatimChar"/>
+          <w:sz w:val="22"/>
+          <w:szCs w:val="22"/>
         </w:rPr>
         <w:t>exp1.csv</w:t>
       </w:r>
@@ -662,10 +876,16 @@
         </w:numPr>
         <w:bidi w:val="0"/>
         <w:jc w:val="start"/>
-        <w:rPr/>
-      </w:pPr>
-      <w:r>
-        <w:rPr/>
+        <w:rPr>
+          <w:sz w:val="22"/>
+          <w:szCs w:val="22"/>
+        </w:rPr>
+      </w:pPr>
+      <w:r>
+        <w:rPr>
+          <w:sz w:val="22"/>
+          <w:szCs w:val="22"/>
+        </w:rPr>
         <w:t>Für jede Zeile:</w:t>
       </w:r>
     </w:p>
@@ -678,10 +898,16 @@
         </w:numPr>
         <w:bidi w:val="0"/>
         <w:jc w:val="start"/>
-        <w:rPr/>
-      </w:pPr>
-      <w:r>
-        <w:rPr/>
+        <w:rPr>
+          <w:sz w:val="22"/>
+          <w:szCs w:val="22"/>
+        </w:rPr>
+      </w:pPr>
+      <w:r>
+        <w:rPr>
+          <w:sz w:val="22"/>
+          <w:szCs w:val="22"/>
+        </w:rPr>
         <w:t>Öffnen Sie die entsprechende Fragendatei und lesen Sie die Frage sorgfältig</w:t>
       </w:r>
     </w:p>
@@ -694,10 +920,16 @@
         </w:numPr>
         <w:bidi w:val="0"/>
         <w:jc w:val="start"/>
-        <w:rPr/>
-      </w:pPr>
-      <w:r>
-        <w:rPr/>
+        <w:rPr>
+          <w:sz w:val="22"/>
+          <w:szCs w:val="22"/>
+        </w:rPr>
+      </w:pPr>
+      <w:r>
+        <w:rPr>
+          <w:sz w:val="22"/>
+          <w:szCs w:val="22"/>
+        </w:rPr>
         <w:t>Prüfen Sie den Quelltext, welcher direkt unter der Frage angegeben ist</w:t>
       </w:r>
     </w:p>
@@ -710,10 +942,16 @@
         </w:numPr>
         <w:bidi w:val="0"/>
         <w:jc w:val="start"/>
-        <w:rPr/>
-      </w:pPr>
-      <w:r>
-        <w:rPr/>
+        <w:rPr>
+          <w:sz w:val="22"/>
+          <w:szCs w:val="22"/>
+        </w:rPr>
+      </w:pPr>
+      <w:r>
+        <w:rPr>
+          <w:sz w:val="22"/>
+          <w:szCs w:val="22"/>
+        </w:rPr>
         <w:t>Bewerten Sie nach den 7 Kategorien der Rubrik (1-5 Punkte), und notieren Sie Ihre Bewertungen in die entsprechenden Spalten</w:t>
       </w:r>
     </w:p>
@@ -729,12 +967,17 @@
         <w:rPr/>
       </w:pPr>
       <w:r>
-        <w:rPr/>
+        <w:rPr>
+          <w:sz w:val="22"/>
+          <w:szCs w:val="22"/>
+        </w:rPr>
         <w:t xml:space="preserve">Notieren Sie gegebenenfalls problematische Antworten/Antwortoptionen in </w:t>
       </w:r>
       <w:r>
         <w:rPr>
           <w:rStyle w:val="VerbatimChar"/>
+          <w:sz w:val="22"/>
+          <w:szCs w:val="22"/>
         </w:rPr>
         <w:t>answer_problems</w:t>
       </w:r>
@@ -748,10 +991,16 @@
         </w:numPr>
         <w:bidi w:val="0"/>
         <w:jc w:val="start"/>
-        <w:rPr/>
-      </w:pPr>
-      <w:r>
-        <w:rPr/>
+        <w:rPr>
+          <w:sz w:val="22"/>
+          <w:szCs w:val="22"/>
+        </w:rPr>
+      </w:pPr>
+      <w:r>
+        <w:rPr>
+          <w:sz w:val="22"/>
+          <w:szCs w:val="22"/>
+        </w:rPr>
         <w:t>Ergänzen Sie bei Bedarf Kommentare</w:t>
       </w:r>
     </w:p>
@@ -779,10 +1028,16 @@
         </w:numPr>
         <w:bidi w:val="0"/>
         <w:jc w:val="start"/>
-        <w:rPr/>
-      </w:pPr>
-      <w:r>
-        <w:rPr/>
+        <w:rPr>
+          <w:sz w:val="22"/>
+          <w:szCs w:val="22"/>
+        </w:rPr>
+      </w:pPr>
+      <w:r>
+        <w:rPr>
+          <w:sz w:val="22"/>
+          <w:szCs w:val="22"/>
+        </w:rPr>
         <w:t>Ist die Frage fachlich korrekt bezogen auf den Layer-Text?</w:t>
       </w:r>
     </w:p>
@@ -795,12 +1050,18 @@
         </w:numPr>
         <w:bidi w:val="0"/>
         <w:jc w:val="start"/>
-        <w:rPr/>
+        <w:rPr>
+          <w:sz w:val="22"/>
+          <w:szCs w:val="22"/>
+        </w:rPr>
       </w:pPr>
       <w:bookmarkStart w:id="3" w:name="anleitung-für-experten"/>
       <w:bookmarkStart w:id="4" w:name="schritt-3-bewertung-durchführen"/>
       <w:r>
-        <w:rPr/>
+        <w:rPr>
+          <w:sz w:val="22"/>
+          <w:szCs w:val="22"/>
+        </w:rPr>
         <w:t>Sind alle im Text enthaltenen Informationen richtig wiedergegeben?</w:t>
       </w:r>
       <w:bookmarkEnd w:id="3"/>
@@ -823,12 +1084,18 @@
         <w:pStyle w:val="FirstParagraph"/>
         <w:bidi w:val="0"/>
         <w:jc w:val="start"/>
-        <w:rPr/>
+        <w:rPr>
+          <w:sz w:val="22"/>
+          <w:szCs w:val="22"/>
+        </w:rPr>
       </w:pPr>
       <w:bookmarkStart w:id="5" w:name="Xdef6236bb5f38117b519091ae3187e154a68fb8"/>
       <w:bookmarkStart w:id="6" w:name="dankbarkeit"/>
       <w:r>
-        <w:rPr/>
+        <w:rPr>
+          <w:sz w:val="22"/>
+          <w:szCs w:val="22"/>
+        </w:rPr>
         <w:t>Vielen Dank für Ihre Unterstützung bei der Evaluation! Ihre Einschätzungen sind wertvoll für die Forschung.</w:t>
       </w:r>
       <w:bookmarkEnd w:id="5"/>
@@ -836,227 +1103,6 @@
     </w:p>
     <w:p>
       <w:pPr>
-        <w:pStyle w:val="BodyText"/>
-        <w:bidi w:val="0"/>
-        <w:jc w:val="start"/>
-        <w:rPr/>
-      </w:pPr>
-      <w:r>
-        <w:rPr/>
-      </w:r>
-    </w:p>
-    <w:p>
-      <w:pPr>
-        <w:pStyle w:val="BodyText"/>
-        <w:bidi w:val="0"/>
-        <w:jc w:val="start"/>
-        <w:rPr/>
-      </w:pPr>
-      <w:r>
-        <w:rPr/>
-      </w:r>
-    </w:p>
-    <w:p>
-      <w:pPr>
-        <w:pStyle w:val="BodyText"/>
-        <w:bidi w:val="0"/>
-        <w:jc w:val="start"/>
-        <w:rPr/>
-      </w:pPr>
-      <w:r>
-        <w:rPr/>
-      </w:r>
-    </w:p>
-    <w:p>
-      <w:pPr>
-        <w:pStyle w:val="BodyText"/>
-        <w:bidi w:val="0"/>
-        <w:jc w:val="start"/>
-        <w:rPr/>
-      </w:pPr>
-      <w:r>
-        <w:rPr/>
-      </w:r>
-    </w:p>
-    <w:p>
-      <w:pPr>
-        <w:pStyle w:val="BodyText"/>
-        <w:bidi w:val="0"/>
-        <w:jc w:val="start"/>
-        <w:rPr/>
-      </w:pPr>
-      <w:r>
-        <w:rPr/>
-      </w:r>
-    </w:p>
-    <w:p>
-      <w:pPr>
-        <w:pStyle w:val="BodyText"/>
-        <w:bidi w:val="0"/>
-        <w:jc w:val="start"/>
-        <w:rPr/>
-      </w:pPr>
-      <w:r>
-        <w:rPr/>
-      </w:r>
-    </w:p>
-    <w:p>
-      <w:pPr>
-        <w:pStyle w:val="BodyText"/>
-        <w:bidi w:val="0"/>
-        <w:jc w:val="start"/>
-        <w:rPr/>
-      </w:pPr>
-      <w:r>
-        <w:rPr/>
-      </w:r>
-    </w:p>
-    <w:p>
-      <w:pPr>
-        <w:pStyle w:val="BodyText"/>
-        <w:bidi w:val="0"/>
-        <w:jc w:val="start"/>
-        <w:rPr/>
-      </w:pPr>
-      <w:r>
-        <w:rPr/>
-      </w:r>
-    </w:p>
-    <w:p>
-      <w:pPr>
-        <w:pStyle w:val="BodyText"/>
-        <w:bidi w:val="0"/>
-        <w:jc w:val="start"/>
-        <w:rPr/>
-      </w:pPr>
-      <w:r>
-        <w:rPr/>
-      </w:r>
-    </w:p>
-    <w:p>
-      <w:pPr>
-        <w:pStyle w:val="BodyText"/>
-        <w:bidi w:val="0"/>
-        <w:jc w:val="start"/>
-        <w:rPr/>
-      </w:pPr>
-      <w:r>
-        <w:rPr/>
-      </w:r>
-    </w:p>
-    <w:p>
-      <w:pPr>
-        <w:pStyle w:val="BodyText"/>
-        <w:bidi w:val="0"/>
-        <w:jc w:val="start"/>
-        <w:rPr/>
-      </w:pPr>
-      <w:r>
-        <w:rPr/>
-      </w:r>
-    </w:p>
-    <w:p>
-      <w:pPr>
-        <w:pStyle w:val="BodyText"/>
-        <w:bidi w:val="0"/>
-        <w:jc w:val="start"/>
-        <w:rPr/>
-      </w:pPr>
-      <w:r>
-        <w:rPr/>
-      </w:r>
-    </w:p>
-    <w:p>
-      <w:pPr>
-        <w:pStyle w:val="BodyText"/>
-        <w:bidi w:val="0"/>
-        <w:jc w:val="start"/>
-        <w:rPr/>
-      </w:pPr>
-      <w:r>
-        <w:rPr/>
-      </w:r>
-    </w:p>
-    <w:p>
-      <w:pPr>
-        <w:pStyle w:val="BodyText"/>
-        <w:bidi w:val="0"/>
-        <w:jc w:val="start"/>
-        <w:rPr/>
-      </w:pPr>
-      <w:r>
-        <w:rPr/>
-      </w:r>
-    </w:p>
-    <w:p>
-      <w:pPr>
-        <w:pStyle w:val="BodyText"/>
-        <w:bidi w:val="0"/>
-        <w:jc w:val="start"/>
-        <w:rPr/>
-      </w:pPr>
-      <w:r>
-        <w:rPr/>
-      </w:r>
-    </w:p>
-    <w:p>
-      <w:pPr>
-        <w:pStyle w:val="BodyText"/>
-        <w:bidi w:val="0"/>
-        <w:jc w:val="start"/>
-        <w:rPr/>
-      </w:pPr>
-      <w:r>
-        <w:rPr/>
-      </w:r>
-    </w:p>
-    <w:p>
-      <w:pPr>
-        <w:pStyle w:val="BodyText"/>
-        <w:bidi w:val="0"/>
-        <w:jc w:val="start"/>
-        <w:rPr/>
-      </w:pPr>
-      <w:r>
-        <w:rPr/>
-      </w:r>
-    </w:p>
-    <w:p>
-      <w:pPr>
-        <w:pStyle w:val="BodyText"/>
-        <w:bidi w:val="0"/>
-        <w:jc w:val="start"/>
-        <w:rPr/>
-      </w:pPr>
-      <w:r>
-        <w:rPr/>
-      </w:r>
-    </w:p>
-    <w:p>
-      <w:pPr>
-        <w:pStyle w:val="BodyText"/>
-        <w:bidi w:val="0"/>
-        <w:jc w:val="start"/>
-        <w:rPr/>
-      </w:pPr>
-      <w:r>
-        <w:rPr/>
-      </w:r>
-    </w:p>
-    <w:p>
-      <w:pPr>
-        <w:pStyle w:val="BodyText"/>
-        <w:bidi w:val="0"/>
-        <w:jc w:val="start"/>
-        <w:rPr/>
-      </w:pPr>
-      <w:r>
-        <w:rPr/>
-        <w:softHyphen/>
-      </w:r>
-    </w:p>
-    <w:p>
-      <w:pPr>
         <w:pStyle w:val="Heading1"/>
         <w:bidi w:val="0"/>
         <w:jc w:val="start"/>
@@ -1084,17 +1130,25 @@
         <w:pStyle w:val="FirstParagraph"/>
         <w:bidi w:val="0"/>
         <w:jc w:val="start"/>
-        <w:rPr/>
+        <w:rPr>
+          <w:sz w:val="22"/>
+          <w:szCs w:val="22"/>
+        </w:rPr>
       </w:pPr>
       <w:r>
         <w:rPr>
           <w:b/>
           <w:bCs/>
+          <w:sz w:val="22"/>
+          <w:szCs w:val="22"/>
         </w:rPr>
         <w:t>Fragestellung:</w:t>
       </w:r>
       <w:r>
-        <w:rPr/>
+        <w:rPr>
+          <w:sz w:val="22"/>
+          <w:szCs w:val="22"/>
+        </w:rPr>
         <w:t xml:space="preserve"> Wie gut bezieht sich die Frage auf den Inhalt des bereitgestellten Textes?</w:t>
       </w:r>
     </w:p>
@@ -1107,17 +1161,25 @@
         </w:numPr>
         <w:bidi w:val="0"/>
         <w:jc w:val="start"/>
-        <w:rPr/>
+        <w:rPr>
+          <w:sz w:val="22"/>
+          <w:szCs w:val="22"/>
+        </w:rPr>
       </w:pPr>
       <w:r>
         <w:rPr>
           <w:b/>
           <w:bCs/>
+          <w:sz w:val="22"/>
+          <w:szCs w:val="22"/>
         </w:rPr>
         <w:t>5 - Überaus relevant:</w:t>
       </w:r>
       <w:r>
-        <w:rPr/>
+        <w:rPr>
+          <w:sz w:val="22"/>
+          <w:szCs w:val="22"/>
+        </w:rPr>
         <w:t xml:space="preserve"> Bezieht sich auf zentrale Themen und korrekte Fachbegriffe</w:t>
       </w:r>
     </w:p>
@@ -1130,10 +1192,16 @@
         </w:numPr>
         <w:bidi w:val="0"/>
         <w:jc w:val="start"/>
-        <w:rPr/>
-      </w:pPr>
-      <w:r>
-        <w:rPr/>
+        <w:rPr>
+          <w:sz w:val="22"/>
+          <w:szCs w:val="22"/>
+        </w:rPr>
+      </w:pPr>
+      <w:r>
+        <w:rPr>
+          <w:sz w:val="22"/>
+          <w:szCs w:val="22"/>
+        </w:rPr>
         <w:t>Bsp.: “Welche Kernaufgaben erfüllt der Data Link Layer und worin unterscheiden sich diese hinsichtlich ihrer Zielsetzung?”</w:t>
       </w:r>
     </w:p>
@@ -1146,17 +1214,25 @@
         </w:numPr>
         <w:bidi w:val="0"/>
         <w:jc w:val="start"/>
-        <w:rPr/>
+        <w:rPr>
+          <w:sz w:val="22"/>
+          <w:szCs w:val="22"/>
+        </w:rPr>
       </w:pPr>
       <w:r>
         <w:rPr>
           <w:b/>
           <w:bCs/>
+          <w:sz w:val="22"/>
+          <w:szCs w:val="22"/>
         </w:rPr>
         <w:t>4 - Relevant:</w:t>
       </w:r>
       <w:r>
-        <w:rPr/>
+        <w:rPr>
+          <w:sz w:val="22"/>
+          <w:szCs w:val="22"/>
+        </w:rPr>
         <w:t xml:space="preserve"> Bezieht sich auf wichtige Textinhalte</w:t>
       </w:r>
     </w:p>
@@ -1169,17 +1245,25 @@
         </w:numPr>
         <w:bidi w:val="0"/>
         <w:jc w:val="start"/>
-        <w:rPr/>
+        <w:rPr>
+          <w:sz w:val="22"/>
+          <w:szCs w:val="22"/>
+        </w:rPr>
       </w:pPr>
       <w:r>
         <w:rPr>
           <w:b/>
           <w:bCs/>
+          <w:sz w:val="22"/>
+          <w:szCs w:val="22"/>
         </w:rPr>
         <w:t>3 - Mäßig relevant:</w:t>
       </w:r>
       <w:r>
-        <w:rPr/>
+        <w:rPr>
+          <w:sz w:val="22"/>
+          <w:szCs w:val="22"/>
+        </w:rPr>
         <w:t xml:space="preserve"> Behandelt eher nebensächliche Aspekte des Textes</w:t>
       </w:r>
     </w:p>
@@ -1192,17 +1276,25 @@
         </w:numPr>
         <w:bidi w:val="0"/>
         <w:jc w:val="start"/>
-        <w:rPr/>
+        <w:rPr>
+          <w:sz w:val="22"/>
+          <w:szCs w:val="22"/>
+        </w:rPr>
       </w:pPr>
       <w:r>
         <w:rPr>
           <w:b/>
           <w:bCs/>
+          <w:sz w:val="22"/>
+          <w:szCs w:val="22"/>
         </w:rPr>
         <w:t>2 - Weniger relevant:</w:t>
       </w:r>
       <w:r>
-        <w:rPr/>
+        <w:rPr>
+          <w:sz w:val="22"/>
+          <w:szCs w:val="22"/>
+        </w:rPr>
         <w:t xml:space="preserve"> Nur oberflächlicher Textbezug</w:t>
       </w:r>
     </w:p>
@@ -1215,17 +1307,25 @@
         </w:numPr>
         <w:bidi w:val="0"/>
         <w:jc w:val="start"/>
-        <w:rPr/>
+        <w:rPr>
+          <w:sz w:val="22"/>
+          <w:szCs w:val="22"/>
+        </w:rPr>
       </w:pPr>
       <w:r>
         <w:rPr>
           <w:b/>
           <w:bCs/>
+          <w:sz w:val="22"/>
+          <w:szCs w:val="22"/>
         </w:rPr>
         <w:t>1 - Nicht relevant:</w:t>
       </w:r>
       <w:r>
-        <w:rPr/>
+        <w:rPr>
+          <w:sz w:val="22"/>
+          <w:szCs w:val="22"/>
+        </w:rPr>
         <w:t xml:space="preserve"> Kein Bezug zum Textinhalt</w:t>
       </w:r>
     </w:p>
@@ -1238,11 +1338,17 @@
         </w:numPr>
         <w:bidi w:val="0"/>
         <w:jc w:val="start"/>
-        <w:rPr/>
+        <w:rPr>
+          <w:sz w:val="22"/>
+          <w:szCs w:val="22"/>
+        </w:rPr>
       </w:pPr>
       <w:bookmarkStart w:id="7" w:name="relevanzrelevance"/>
       <w:r>
-        <w:rPr/>
+        <w:rPr>
+          <w:sz w:val="22"/>
+          <w:szCs w:val="22"/>
+        </w:rPr>
         <w:t>Bsp.: “Welche Programmiersprache wird am häufigsten für die Implementierung von Netzwerkprotokollen verwendet?”</w:t>
       </w:r>
       <w:bookmarkEnd w:id="7"/>
@@ -1264,17 +1370,25 @@
         <w:pStyle w:val="FirstParagraph"/>
         <w:bidi w:val="0"/>
         <w:jc w:val="start"/>
-        <w:rPr/>
+        <w:rPr>
+          <w:sz w:val="22"/>
+          <w:szCs w:val="22"/>
+        </w:rPr>
       </w:pPr>
       <w:r>
         <w:rPr>
           <w:b/>
           <w:bCs/>
+          <w:sz w:val="22"/>
+          <w:szCs w:val="22"/>
         </w:rPr>
         <w:t>Fragestellung:</w:t>
       </w:r>
       <w:r>
-        <w:rPr/>
+        <w:rPr>
+          <w:sz w:val="22"/>
+          <w:szCs w:val="22"/>
+        </w:rPr>
         <w:t xml:space="preserve"> Wie eindeutig und verständlich ist die Frage formuliert?</w:t>
       </w:r>
     </w:p>
@@ -1287,17 +1401,25 @@
         </w:numPr>
         <w:bidi w:val="0"/>
         <w:jc w:val="start"/>
-        <w:rPr/>
+        <w:rPr>
+          <w:sz w:val="22"/>
+          <w:szCs w:val="22"/>
+        </w:rPr>
       </w:pPr>
       <w:r>
         <w:rPr>
           <w:b/>
           <w:bCs/>
+          <w:sz w:val="22"/>
+          <w:szCs w:val="22"/>
         </w:rPr>
         <w:t>5 - Sehr klar:</w:t>
       </w:r>
       <w:r>
-        <w:rPr/>
+        <w:rPr>
+          <w:sz w:val="22"/>
+          <w:szCs w:val="22"/>
+        </w:rPr>
         <w:t xml:space="preserve"> Präzise, eindeutig formuliert, keine Mehrdeutigkeiten</w:t>
       </w:r>
     </w:p>
@@ -1310,10 +1432,16 @@
         </w:numPr>
         <w:bidi w:val="0"/>
         <w:jc w:val="start"/>
-        <w:rPr/>
-      </w:pPr>
-      <w:r>
-        <w:rPr/>
+        <w:rPr>
+          <w:sz w:val="22"/>
+          <w:szCs w:val="22"/>
+        </w:rPr>
+      </w:pPr>
+      <w:r>
+        <w:rPr>
+          <w:sz w:val="22"/>
+          <w:szCs w:val="22"/>
+        </w:rPr>
         <w:t>Bsp.: “Nennen Sie die Kernaufgaben der Session Layer und erläutern Sie jeweils deren Funktion.”</w:t>
       </w:r>
     </w:p>
@@ -1326,17 +1454,25 @@
         </w:numPr>
         <w:bidi w:val="0"/>
         <w:jc w:val="start"/>
-        <w:rPr/>
+        <w:rPr>
+          <w:sz w:val="22"/>
+          <w:szCs w:val="22"/>
+        </w:rPr>
       </w:pPr>
       <w:r>
         <w:rPr>
           <w:b/>
           <w:bCs/>
+          <w:sz w:val="22"/>
+          <w:szCs w:val="22"/>
         </w:rPr>
         <w:t>4 - Klar:</w:t>
       </w:r>
       <w:r>
-        <w:rPr/>
+        <w:rPr>
+          <w:sz w:val="22"/>
+          <w:szCs w:val="22"/>
+        </w:rPr>
         <w:t xml:space="preserve"> Verständlich mit minimalen Unklarheiten</w:t>
       </w:r>
     </w:p>
@@ -1349,17 +1485,25 @@
         </w:numPr>
         <w:bidi w:val="0"/>
         <w:jc w:val="start"/>
-        <w:rPr/>
+        <w:rPr>
+          <w:sz w:val="22"/>
+          <w:szCs w:val="22"/>
+        </w:rPr>
       </w:pPr>
       <w:r>
         <w:rPr>
           <w:b/>
           <w:bCs/>
+          <w:sz w:val="22"/>
+          <w:szCs w:val="22"/>
         </w:rPr>
         <w:t>3 - Mäßig klar:</w:t>
       </w:r>
       <w:r>
-        <w:rPr/>
+        <w:rPr>
+          <w:sz w:val="22"/>
+          <w:szCs w:val="22"/>
+        </w:rPr>
         <w:t xml:space="preserve"> Enthält einige unklare Formulierungen</w:t>
       </w:r>
     </w:p>
@@ -1372,17 +1516,25 @@
         </w:numPr>
         <w:bidi w:val="0"/>
         <w:jc w:val="start"/>
-        <w:rPr/>
+        <w:rPr>
+          <w:sz w:val="22"/>
+          <w:szCs w:val="22"/>
+        </w:rPr>
       </w:pPr>
       <w:r>
         <w:rPr>
           <w:b/>
           <w:bCs/>
+          <w:sz w:val="22"/>
+          <w:szCs w:val="22"/>
         </w:rPr>
         <w:t>2 - Unklar:</w:t>
       </w:r>
       <w:r>
-        <w:rPr/>
+        <w:rPr>
+          <w:sz w:val="22"/>
+          <w:szCs w:val="22"/>
+        </w:rPr>
         <w:t xml:space="preserve"> Enthält mehrere mehrdeutige oder verwirrende Elemente</w:t>
       </w:r>
     </w:p>
@@ -1395,17 +1547,25 @@
         </w:numPr>
         <w:bidi w:val="0"/>
         <w:jc w:val="start"/>
-        <w:rPr/>
+        <w:rPr>
+          <w:sz w:val="22"/>
+          <w:szCs w:val="22"/>
+        </w:rPr>
       </w:pPr>
       <w:r>
         <w:rPr>
           <w:b/>
           <w:bCs/>
+          <w:sz w:val="22"/>
+          <w:szCs w:val="22"/>
         </w:rPr>
         <w:t>1 - Sehr unklar:</w:t>
       </w:r>
       <w:r>
-        <w:rPr/>
+        <w:rPr>
+          <w:sz w:val="22"/>
+          <w:szCs w:val="22"/>
+        </w:rPr>
         <w:t xml:space="preserve"> Schwer verständlich oder grammatikalisch fehlerhaft</w:t>
       </w:r>
     </w:p>
@@ -1418,11 +1578,17 @@
         </w:numPr>
         <w:bidi w:val="0"/>
         <w:jc w:val="start"/>
-        <w:rPr/>
+        <w:rPr>
+          <w:sz w:val="22"/>
+          <w:szCs w:val="22"/>
+        </w:rPr>
       </w:pPr>
       <w:bookmarkStart w:id="8" w:name="klarheitclarity"/>
       <w:r>
-        <w:rPr/>
+        <w:rPr>
+          <w:sz w:val="22"/>
+          <w:szCs w:val="22"/>
+        </w:rPr>
         <w:t>Bsp.: “Inwiefern spielt die Schicht eine Rolle bei dem, was passiert, wenn Kommunikation stattfindet?”</w:t>
       </w:r>
       <w:bookmarkEnd w:id="8"/>
@@ -1444,17 +1610,25 @@
         <w:pStyle w:val="FirstParagraph"/>
         <w:bidi w:val="0"/>
         <w:jc w:val="start"/>
-        <w:rPr/>
+        <w:rPr>
+          <w:sz w:val="22"/>
+          <w:szCs w:val="22"/>
+        </w:rPr>
       </w:pPr>
       <w:r>
         <w:rPr>
           <w:b/>
           <w:bCs/>
+          <w:sz w:val="22"/>
+          <w:szCs w:val="22"/>
         </w:rPr>
         <w:t>Fragestellung:</w:t>
       </w:r>
       <w:r>
-        <w:rPr/>
+        <w:rPr>
+          <w:sz w:val="22"/>
+          <w:szCs w:val="22"/>
+        </w:rPr>
         <w:t xml:space="preserve"> Wie gut können Studierende die Frage mit den verfügbaren Textinformationen beantworten?</w:t>
       </w:r>
     </w:p>
@@ -1467,17 +1641,25 @@
         </w:numPr>
         <w:bidi w:val="0"/>
         <w:jc w:val="start"/>
-        <w:rPr/>
+        <w:rPr>
+          <w:sz w:val="22"/>
+          <w:szCs w:val="22"/>
+        </w:rPr>
       </w:pPr>
       <w:r>
         <w:rPr>
           <w:b/>
           <w:bCs/>
+          <w:sz w:val="22"/>
+          <w:szCs w:val="22"/>
         </w:rPr>
         <w:t>5 - Vollständig beantwortbar:</w:t>
       </w:r>
       <w:r>
-        <w:rPr/>
+        <w:rPr>
+          <w:sz w:val="22"/>
+          <w:szCs w:val="22"/>
+        </w:rPr>
         <w:t xml:space="preserve"> Alle Infos explizit im Text verfügbar</w:t>
       </w:r>
     </w:p>
@@ -1490,10 +1672,16 @@
         </w:numPr>
         <w:bidi w:val="0"/>
         <w:jc w:val="start"/>
-        <w:rPr/>
-      </w:pPr>
-      <w:r>
-        <w:rPr/>
+        <w:rPr>
+          <w:sz w:val="22"/>
+          <w:szCs w:val="22"/>
+        </w:rPr>
+      </w:pPr>
+      <w:r>
+        <w:rPr>
+          <w:sz w:val="22"/>
+          <w:szCs w:val="22"/>
+        </w:rPr>
         <w:t>Bsp: “Welche Kernaufgaben hat der Presentation Layer?”</w:t>
       </w:r>
     </w:p>
@@ -1506,17 +1694,25 @@
         </w:numPr>
         <w:bidi w:val="0"/>
         <w:jc w:val="start"/>
-        <w:rPr/>
+        <w:rPr>
+          <w:sz w:val="22"/>
+          <w:szCs w:val="22"/>
+        </w:rPr>
       </w:pPr>
       <w:r>
         <w:rPr>
           <w:b/>
           <w:bCs/>
+          <w:sz w:val="22"/>
+          <w:szCs w:val="22"/>
         </w:rPr>
         <w:t>4 - Gut beantwortbar:</w:t>
       </w:r>
       <w:r>
-        <w:rPr/>
+        <w:rPr>
+          <w:sz w:val="22"/>
+          <w:szCs w:val="22"/>
+        </w:rPr>
         <w:t xml:space="preserve"> Die meisten Infos im Text, minimale Schlüsse nötig</w:t>
       </w:r>
     </w:p>
@@ -1529,17 +1725,25 @@
         </w:numPr>
         <w:bidi w:val="0"/>
         <w:jc w:val="start"/>
-        <w:rPr/>
+        <w:rPr>
+          <w:sz w:val="22"/>
+          <w:szCs w:val="22"/>
+        </w:rPr>
       </w:pPr>
       <w:r>
         <w:rPr>
           <w:b/>
           <w:bCs/>
+          <w:sz w:val="22"/>
+          <w:szCs w:val="22"/>
         </w:rPr>
         <w:t>3 - Teilweise beantwortbar:</w:t>
       </w:r>
       <w:r>
-        <w:rPr/>
+        <w:rPr>
+          <w:sz w:val="22"/>
+          <w:szCs w:val="22"/>
+        </w:rPr>
         <w:t xml:space="preserve"> Grundinfos vorhanden, moderate Interpretation nötig</w:t>
       </w:r>
     </w:p>
@@ -1552,17 +1756,25 @@
         </w:numPr>
         <w:bidi w:val="0"/>
         <w:jc w:val="start"/>
-        <w:rPr/>
+        <w:rPr>
+          <w:sz w:val="22"/>
+          <w:szCs w:val="22"/>
+        </w:rPr>
       </w:pPr>
       <w:r>
         <w:rPr>
           <w:b/>
           <w:bCs/>
+          <w:sz w:val="22"/>
+          <w:szCs w:val="22"/>
         </w:rPr>
         <w:t>2 - Schwer beantwortbar:</w:t>
       </w:r>
       <w:r>
-        <w:rPr/>
+        <w:rPr>
+          <w:sz w:val="22"/>
+          <w:szCs w:val="22"/>
+        </w:rPr>
         <w:t xml:space="preserve"> Wenige relevante Infos, viel eigene Ableitung erforderlich</w:t>
       </w:r>
     </w:p>
@@ -1575,17 +1787,25 @@
         </w:numPr>
         <w:bidi w:val="0"/>
         <w:jc w:val="start"/>
-        <w:rPr/>
+        <w:rPr>
+          <w:sz w:val="22"/>
+          <w:szCs w:val="22"/>
+        </w:rPr>
       </w:pPr>
       <w:r>
         <w:rPr>
           <w:b/>
           <w:bCs/>
+          <w:sz w:val="22"/>
+          <w:szCs w:val="22"/>
         </w:rPr>
         <w:t>1 - Nicht beantwortbar:</w:t>
       </w:r>
       <w:r>
-        <w:rPr/>
+        <w:rPr>
+          <w:sz w:val="22"/>
+          <w:szCs w:val="22"/>
+        </w:rPr>
         <w:t xml:space="preserve"> Benötigte Informationen fehlen größtenteils</w:t>
       </w:r>
     </w:p>
@@ -1598,11 +1818,17 @@
         </w:numPr>
         <w:bidi w:val="0"/>
         <w:jc w:val="start"/>
-        <w:rPr/>
+        <w:rPr>
+          <w:sz w:val="22"/>
+          <w:szCs w:val="22"/>
+        </w:rPr>
       </w:pPr>
       <w:bookmarkStart w:id="9" w:name="beantwortbarkeitanswerability"/>
       <w:r>
-        <w:rPr/>
+        <w:rPr>
+          <w:sz w:val="22"/>
+          <w:szCs w:val="22"/>
+        </w:rPr>
         <w:t>Bsp.: “Vergleichen Sie die Effizienz des ISO-OSI-Modells mit modernen Software-Defined-Networking-Ansätzen.”</w:t>
       </w:r>
       <w:bookmarkEnd w:id="9"/>
@@ -1624,17 +1850,25 @@
         <w:pStyle w:val="FirstParagraph"/>
         <w:bidi w:val="0"/>
         <w:jc w:val="start"/>
-        <w:rPr/>
+        <w:rPr>
+          <w:sz w:val="22"/>
+          <w:szCs w:val="22"/>
+        </w:rPr>
       </w:pPr>
       <w:r>
         <w:rPr>
           <w:b/>
           <w:bCs/>
+          <w:sz w:val="22"/>
+          <w:szCs w:val="22"/>
         </w:rPr>
         <w:t>Fragestellung:</w:t>
       </w:r>
       <w:r>
-        <w:rPr/>
+        <w:rPr>
+          <w:sz w:val="22"/>
+          <w:szCs w:val="22"/>
+        </w:rPr>
         <w:t xml:space="preserve"> Wie anspruchsvoll ist die kognitive Anforderung der Frage?</w:t>
       </w:r>
     </w:p>
@@ -1647,17 +1881,25 @@
         </w:numPr>
         <w:bidi w:val="0"/>
         <w:jc w:val="start"/>
-        <w:rPr/>
+        <w:rPr>
+          <w:sz w:val="22"/>
+          <w:szCs w:val="22"/>
+        </w:rPr>
       </w:pPr>
       <w:r>
         <w:rPr>
           <w:b/>
           <w:bCs/>
+          <w:sz w:val="22"/>
+          <w:szCs w:val="22"/>
         </w:rPr>
         <w:t>5 - Sehr herausfordernd:</w:t>
       </w:r>
       <w:r>
-        <w:rPr/>
+        <w:rPr>
+          <w:sz w:val="22"/>
+          <w:szCs w:val="22"/>
+        </w:rPr>
         <w:t xml:space="preserve"> Erfordert tiefgehende Analyse des gesamten Textes</w:t>
       </w:r>
     </w:p>
@@ -1670,10 +1912,16 @@
         </w:numPr>
         <w:bidi w:val="0"/>
         <w:jc w:val="start"/>
-        <w:rPr/>
-      </w:pPr>
-      <w:r>
-        <w:rPr/>
+        <w:rPr>
+          <w:sz w:val="22"/>
+          <w:szCs w:val="22"/>
+        </w:rPr>
+      </w:pPr>
+      <w:r>
+        <w:rPr>
+          <w:sz w:val="22"/>
+          <w:szCs w:val="22"/>
+        </w:rPr>
         <w:t>Bsp.: “Analysieren Sie, warum Flusssteuerung auf mehreren OSI-Schichten implementiert wird, und bewerten Sie die Notwendigkeit dieser Redundanz.”</w:t>
       </w:r>
     </w:p>
@@ -1686,17 +1934,25 @@
         </w:numPr>
         <w:bidi w:val="0"/>
         <w:jc w:val="start"/>
-        <w:rPr/>
+        <w:rPr>
+          <w:sz w:val="22"/>
+          <w:szCs w:val="22"/>
+        </w:rPr>
       </w:pPr>
       <w:r>
         <w:rPr>
           <w:b/>
           <w:bCs/>
+          <w:sz w:val="22"/>
+          <w:szCs w:val="22"/>
         </w:rPr>
         <w:t>4 - Herausfordernd:</w:t>
       </w:r>
       <w:r>
-        <w:rPr/>
+        <w:rPr>
+          <w:sz w:val="22"/>
+          <w:szCs w:val="22"/>
+        </w:rPr>
         <w:t xml:space="preserve"> Erfordert Integration von weit auseinanderliegenden Informationen</w:t>
       </w:r>
     </w:p>
@@ -1709,17 +1965,25 @@
         </w:numPr>
         <w:bidi w:val="0"/>
         <w:jc w:val="start"/>
-        <w:rPr/>
+        <w:rPr>
+          <w:sz w:val="22"/>
+          <w:szCs w:val="22"/>
+        </w:rPr>
       </w:pPr>
       <w:r>
         <w:rPr>
           <w:b/>
           <w:bCs/>
+          <w:sz w:val="22"/>
+          <w:szCs w:val="22"/>
         </w:rPr>
         <w:t>3 - Mäßig herausfordernd:</w:t>
       </w:r>
       <w:r>
-        <w:rPr/>
+        <w:rPr>
+          <w:sz w:val="22"/>
+          <w:szCs w:val="22"/>
+        </w:rPr>
         <w:t xml:space="preserve"> Erfordert Verständnis und einfache Anwendung</w:t>
       </w:r>
     </w:p>
@@ -1732,17 +1996,25 @@
         </w:numPr>
         <w:bidi w:val="0"/>
         <w:jc w:val="start"/>
-        <w:rPr/>
+        <w:rPr>
+          <w:sz w:val="22"/>
+          <w:szCs w:val="22"/>
+        </w:rPr>
       </w:pPr>
       <w:r>
         <w:rPr>
           <w:b/>
           <w:bCs/>
+          <w:sz w:val="22"/>
+          <w:szCs w:val="22"/>
         </w:rPr>
         <w:t>2 - Wenig herausfordernd:</w:t>
       </w:r>
       <w:r>
-        <w:rPr/>
+        <w:rPr>
+          <w:sz w:val="22"/>
+          <w:szCs w:val="22"/>
+        </w:rPr>
         <w:t xml:space="preserve"> Erfordert Auffinden und Wiedergeben</w:t>
       </w:r>
     </w:p>
@@ -1755,17 +2027,25 @@
         </w:numPr>
         <w:bidi w:val="0"/>
         <w:jc w:val="start"/>
-        <w:rPr/>
+        <w:rPr>
+          <w:sz w:val="22"/>
+          <w:szCs w:val="22"/>
+        </w:rPr>
       </w:pPr>
       <w:r>
         <w:rPr>
           <w:b/>
           <w:bCs/>
+          <w:sz w:val="22"/>
+          <w:szCs w:val="22"/>
         </w:rPr>
         <w:t>1 - Nicht herausfordernd:</w:t>
       </w:r>
       <w:r>
-        <w:rPr/>
+        <w:rPr>
+          <w:sz w:val="22"/>
+          <w:szCs w:val="22"/>
+        </w:rPr>
         <w:t xml:space="preserve"> Trivial (Abschreiben oder Ja/Nein)</w:t>
       </w:r>
     </w:p>
@@ -1778,11 +2058,17 @@
         </w:numPr>
         <w:bidi w:val="0"/>
         <w:jc w:val="start"/>
-        <w:rPr/>
+        <w:rPr>
+          <w:sz w:val="22"/>
+          <w:szCs w:val="22"/>
+        </w:rPr>
       </w:pPr>
       <w:bookmarkStart w:id="10" w:name="herausforderungchallenging"/>
       <w:r>
-        <w:rPr/>
+        <w:rPr>
+          <w:sz w:val="22"/>
+          <w:szCs w:val="22"/>
+        </w:rPr>
         <w:t>Bsp.: “Wie viele Kernaufgaben hat der Physical Layer?”</w:t>
       </w:r>
       <w:bookmarkEnd w:id="10"/>
@@ -1804,17 +2090,25 @@
         <w:pStyle w:val="FirstParagraph"/>
         <w:bidi w:val="0"/>
         <w:jc w:val="start"/>
-        <w:rPr/>
+        <w:rPr>
+          <w:sz w:val="22"/>
+          <w:szCs w:val="22"/>
+        </w:rPr>
       </w:pPr>
       <w:r>
         <w:rPr>
           <w:b/>
           <w:bCs/>
+          <w:sz w:val="22"/>
+          <w:szCs w:val="22"/>
         </w:rPr>
         <w:t>Fragestellung:</w:t>
       </w:r>
       <w:r>
-        <w:rPr/>
+        <w:rPr>
+          <w:sz w:val="22"/>
+          <w:szCs w:val="22"/>
+        </w:rPr>
         <w:t xml:space="preserve"> Wie zentral ist das in der Frage behandelte Fachkonzept für das angestrebte Lernziel des Moduls?</w:t>
       </w:r>
     </w:p>
@@ -1827,17 +2121,25 @@
         </w:numPr>
         <w:bidi w:val="0"/>
         <w:jc w:val="start"/>
-        <w:rPr/>
+        <w:rPr>
+          <w:sz w:val="22"/>
+          <w:szCs w:val="22"/>
+        </w:rPr>
       </w:pPr>
       <w:r>
         <w:rPr>
           <w:b/>
           <w:bCs/>
+          <w:sz w:val="22"/>
+          <w:szCs w:val="22"/>
         </w:rPr>
         <w:t>5 - Sehr Hoch:</w:t>
       </w:r>
       <w:r>
-        <w:rPr/>
+        <w:rPr>
+          <w:sz w:val="22"/>
+          <w:szCs w:val="22"/>
+        </w:rPr>
         <w:t xml:space="preserve"> Behandelt Kernkonzept und zentrales Lernziel (hochrelevant)</w:t>
       </w:r>
     </w:p>
@@ -1850,10 +2152,16 @@
         </w:numPr>
         <w:bidi w:val="0"/>
         <w:jc w:val="start"/>
-        <w:rPr/>
-      </w:pPr>
-      <w:r>
-        <w:rPr/>
+        <w:rPr>
+          <w:sz w:val="22"/>
+          <w:szCs w:val="22"/>
+        </w:rPr>
+      </w:pPr>
+      <w:r>
+        <w:rPr>
+          <w:sz w:val="22"/>
+          <w:szCs w:val="22"/>
+        </w:rPr>
         <w:t>Bsp.: “Erklären Sie das Zusammenspiel von Codierung, Transport und Decodierung bei der Übertragung logischer Werte auf physikalischer Ebene.”</w:t>
       </w:r>
     </w:p>
@@ -1866,17 +2174,25 @@
         </w:numPr>
         <w:bidi w:val="0"/>
         <w:jc w:val="start"/>
-        <w:rPr/>
+        <w:rPr>
+          <w:sz w:val="22"/>
+          <w:szCs w:val="22"/>
+        </w:rPr>
       </w:pPr>
       <w:r>
         <w:rPr>
           <w:b/>
           <w:bCs/>
+          <w:sz w:val="22"/>
+          <w:szCs w:val="22"/>
         </w:rPr>
         <w:t>4 - Hoch:</w:t>
       </w:r>
       <w:r>
-        <w:rPr/>
+        <w:rPr>
+          <w:sz w:val="22"/>
+          <w:szCs w:val="22"/>
+        </w:rPr>
         <w:t xml:space="preserve"> Behandelt wichtiges, relevantes Konzept</w:t>
       </w:r>
     </w:p>
@@ -1889,17 +2205,25 @@
         </w:numPr>
         <w:bidi w:val="0"/>
         <w:jc w:val="start"/>
-        <w:rPr/>
+        <w:rPr>
+          <w:sz w:val="22"/>
+          <w:szCs w:val="22"/>
+        </w:rPr>
       </w:pPr>
       <w:r>
         <w:rPr>
           <w:b/>
           <w:bCs/>
+          <w:sz w:val="22"/>
+          <w:szCs w:val="22"/>
         </w:rPr>
         <w:t>3 - Mäßig:</w:t>
       </w:r>
       <w:r>
-        <w:rPr/>
+        <w:rPr>
+          <w:sz w:val="22"/>
+          <w:szCs w:val="22"/>
+        </w:rPr>
         <w:t xml:space="preserve"> Behandelt Grundlagen oder deskriptive Aspekte</w:t>
       </w:r>
     </w:p>
@@ -1912,17 +2236,25 @@
         </w:numPr>
         <w:bidi w:val="0"/>
         <w:jc w:val="start"/>
-        <w:rPr/>
+        <w:rPr>
+          <w:sz w:val="22"/>
+          <w:szCs w:val="22"/>
+        </w:rPr>
       </w:pPr>
       <w:r>
         <w:rPr>
           <w:b/>
           <w:bCs/>
+          <w:sz w:val="22"/>
+          <w:szCs w:val="22"/>
         </w:rPr>
         <w:t>2 - Gering:</w:t>
       </w:r>
       <w:r>
-        <w:rPr/>
+        <w:rPr>
+          <w:sz w:val="22"/>
+          <w:szCs w:val="22"/>
+        </w:rPr>
         <w:t xml:space="preserve"> Fokussiert auf nebensächliches Detail oder ist ineffizient</w:t>
       </w:r>
     </w:p>
@@ -1935,17 +2267,25 @@
         </w:numPr>
         <w:bidi w:val="0"/>
         <w:jc w:val="start"/>
-        <w:rPr/>
+        <w:rPr>
+          <w:sz w:val="22"/>
+          <w:szCs w:val="22"/>
+        </w:rPr>
       </w:pPr>
       <w:r>
         <w:rPr>
           <w:b/>
           <w:bCs/>
+          <w:sz w:val="22"/>
+          <w:szCs w:val="22"/>
         </w:rPr>
         <w:t>1 - Nicht vorhanden:</w:t>
       </w:r>
       <w:r>
-        <w:rPr/>
+        <w:rPr>
+          <w:sz w:val="22"/>
+          <w:szCs w:val="22"/>
+        </w:rPr>
         <w:t xml:space="preserve"> Behandelt irrelevante Details (nicht Teil des Lernziels)</w:t>
       </w:r>
     </w:p>
@@ -1958,11 +2298,17 @@
         </w:numPr>
         <w:bidi w:val="0"/>
         <w:jc w:val="start"/>
-        <w:rPr/>
+        <w:rPr>
+          <w:sz w:val="22"/>
+          <w:szCs w:val="22"/>
+        </w:rPr>
       </w:pPr>
       <w:bookmarkStart w:id="11" w:name="Xc726736414fc4f5118f498bc21832f0e03ad1b3"/>
       <w:r>
-        <w:rPr/>
+        <w:rPr>
+          <w:sz w:val="22"/>
+          <w:szCs w:val="22"/>
+        </w:rPr>
         <w:t>Bsp.: “Nennen Sie ein Beispiel für ein Kabel, das zur Datenübertragung verwendet werden kann.”</w:t>
       </w:r>
       <w:bookmarkEnd w:id="11"/>
@@ -1984,17 +2330,25 @@
         <w:pStyle w:val="FirstParagraph"/>
         <w:bidi w:val="0"/>
         <w:jc w:val="start"/>
-        <w:rPr/>
+        <w:rPr>
+          <w:sz w:val="22"/>
+          <w:szCs w:val="22"/>
+        </w:rPr>
       </w:pPr>
       <w:r>
         <w:rPr>
           <w:b/>
           <w:bCs/>
+          <w:sz w:val="22"/>
+          <w:szCs w:val="22"/>
         </w:rPr>
         <w:t>Fragestellung:</w:t>
       </w:r>
       <w:r>
-        <w:rPr/>
+        <w:rPr>
+          <w:sz w:val="22"/>
+          <w:szCs w:val="22"/>
+        </w:rPr>
         <w:t xml:space="preserve"> Wie angemessen ist die sprachliche Qualität der Frage?</w:t>
       </w:r>
     </w:p>
@@ -2007,17 +2361,25 @@
         </w:numPr>
         <w:bidi w:val="0"/>
         <w:jc w:val="start"/>
-        <w:rPr/>
+        <w:rPr>
+          <w:sz w:val="22"/>
+          <w:szCs w:val="22"/>
+        </w:rPr>
       </w:pPr>
       <w:r>
         <w:rPr>
           <w:b/>
           <w:bCs/>
+          <w:sz w:val="22"/>
+          <w:szCs w:val="22"/>
         </w:rPr>
         <w:t>5 - Ausgezeichnet:</w:t>
       </w:r>
       <w:r>
-        <w:rPr/>
+        <w:rPr>
+          <w:sz w:val="22"/>
+          <w:szCs w:val="22"/>
+        </w:rPr>
         <w:t xml:space="preserve"> Präzise, angemessen, gut verständlich</w:t>
       </w:r>
     </w:p>
@@ -2030,10 +2392,16 @@
         </w:numPr>
         <w:bidi w:val="0"/>
         <w:jc w:val="start"/>
-        <w:rPr/>
-      </w:pPr>
-      <w:r>
-        <w:rPr/>
+        <w:rPr>
+          <w:sz w:val="22"/>
+          <w:szCs w:val="22"/>
+        </w:rPr>
+      </w:pPr>
+      <w:r>
+        <w:rPr>
+          <w:sz w:val="22"/>
+          <w:szCs w:val="22"/>
+        </w:rPr>
         <w:t>Bsp.: “Ermitteln Sie, welche OSI-Schicht für das Setzen von Synchronisationspunkten verantwortlich ist, und erläutern Sie deren Zweck.”</w:t>
       </w:r>
     </w:p>
@@ -2046,17 +2414,25 @@
         </w:numPr>
         <w:bidi w:val="0"/>
         <w:jc w:val="start"/>
-        <w:rPr/>
+        <w:rPr>
+          <w:sz w:val="22"/>
+          <w:szCs w:val="22"/>
+        </w:rPr>
       </w:pPr>
       <w:r>
         <w:rPr>
           <w:b/>
           <w:bCs/>
+          <w:sz w:val="22"/>
+          <w:szCs w:val="22"/>
         </w:rPr>
         <w:t>4 - Gut:</w:t>
       </w:r>
       <w:r>
-        <w:rPr/>
+        <w:rPr>
+          <w:sz w:val="22"/>
+          <w:szCs w:val="22"/>
+        </w:rPr>
         <w:t xml:space="preserve"> Verständlich mit kleinen Schwächen</w:t>
       </w:r>
     </w:p>
@@ -2069,17 +2445,25 @@
         </w:numPr>
         <w:bidi w:val="0"/>
         <w:jc w:val="start"/>
-        <w:rPr/>
+        <w:rPr>
+          <w:sz w:val="22"/>
+          <w:szCs w:val="22"/>
+        </w:rPr>
       </w:pPr>
       <w:r>
         <w:rPr>
           <w:b/>
           <w:bCs/>
+          <w:sz w:val="22"/>
+          <w:szCs w:val="22"/>
         </w:rPr>
         <w:t>3 - Befriedigend:</w:t>
       </w:r>
       <w:r>
-        <w:rPr/>
+        <w:rPr>
+          <w:sz w:val="22"/>
+          <w:szCs w:val="22"/>
+        </w:rPr>
         <w:t xml:space="preserve"> Umständlich oder unpräzise</w:t>
       </w:r>
     </w:p>
@@ -2092,17 +2476,25 @@
         </w:numPr>
         <w:bidi w:val="0"/>
         <w:jc w:val="start"/>
-        <w:rPr/>
+        <w:rPr>
+          <w:sz w:val="22"/>
+          <w:szCs w:val="22"/>
+        </w:rPr>
       </w:pPr>
       <w:r>
         <w:rPr>
           <w:b/>
           <w:bCs/>
+          <w:sz w:val="22"/>
+          <w:szCs w:val="22"/>
         </w:rPr>
         <w:t>2 - Mangelhaft:</w:t>
       </w:r>
       <w:r>
-        <w:rPr/>
+        <w:rPr>
+          <w:sz w:val="22"/>
+          <w:szCs w:val="22"/>
+        </w:rPr>
         <w:t xml:space="preserve"> Schwerfällig, weitschweifig oder unnötig komplex</w:t>
       </w:r>
     </w:p>
@@ -2115,17 +2507,25 @@
         </w:numPr>
         <w:bidi w:val="0"/>
         <w:jc w:val="start"/>
-        <w:rPr/>
+        <w:rPr>
+          <w:sz w:val="22"/>
+          <w:szCs w:val="22"/>
+        </w:rPr>
       </w:pPr>
       <w:r>
         <w:rPr>
           <w:b/>
           <w:bCs/>
+          <w:sz w:val="22"/>
+          <w:szCs w:val="22"/>
         </w:rPr>
         <w:t>1 - Ungenügend:</w:t>
       </w:r>
       <w:r>
-        <w:rPr/>
+        <w:rPr>
+          <w:sz w:val="22"/>
+          <w:szCs w:val="22"/>
+        </w:rPr>
         <w:t xml:space="preserve"> Schwer verständlich oder unangemessen</w:t>
       </w:r>
     </w:p>
@@ -2138,11 +2538,17 @@
         </w:numPr>
         <w:bidi w:val="0"/>
         <w:jc w:val="start"/>
-        <w:rPr/>
+        <w:rPr>
+          <w:sz w:val="22"/>
+          <w:szCs w:val="22"/>
+        </w:rPr>
       </w:pPr>
       <w:bookmarkStart w:id="12" w:name="sprachqualitätlanguage"/>
       <w:r>
-        <w:rPr/>
+        <w:rPr>
+          <w:sz w:val="22"/>
+          <w:szCs w:val="22"/>
+        </w:rPr>
         <w:t>Bsp.: “Im Kontext der vielschichtigen und diversen Betrachtungsweise der Aufgabenbereiche, die dem Physical Layer im Rahmen des OSI-Referenzmodells zugeschrieben werden können, erläutern Sie diese unter Berücksichtigung sämtlicher relevanter Aspekte.”</w:t>
       </w:r>
       <w:bookmarkEnd w:id="12"/>
@@ -2164,17 +2570,25 @@
         <w:pStyle w:val="FirstParagraph"/>
         <w:bidi w:val="0"/>
         <w:jc w:val="start"/>
-        <w:rPr/>
+        <w:rPr>
+          <w:sz w:val="22"/>
+          <w:szCs w:val="22"/>
+        </w:rPr>
       </w:pPr>
       <w:r>
         <w:rPr>
           <w:b/>
           <w:bCs/>
+          <w:sz w:val="22"/>
+          <w:szCs w:val="22"/>
         </w:rPr>
         <w:t>Fragestellung:</w:t>
       </w:r>
       <w:r>
-        <w:rPr/>
+        <w:rPr>
+          <w:sz w:val="22"/>
+          <w:szCs w:val="22"/>
+        </w:rPr>
         <w:t xml:space="preserve"> Wie korrekt sind die in der Frage selbst enthaltenen Aussagen, Annahmen oder impliziten Behauptungen bezogen auf den Text?</w:t>
       </w:r>
     </w:p>
@@ -2187,17 +2601,25 @@
         </w:numPr>
         <w:bidi w:val="0"/>
         <w:jc w:val="start"/>
-        <w:rPr/>
+        <w:rPr>
+          <w:sz w:val="22"/>
+          <w:szCs w:val="22"/>
+        </w:rPr>
       </w:pPr>
       <w:r>
         <w:rPr>
           <w:b/>
           <w:bCs/>
+          <w:sz w:val="22"/>
+          <w:szCs w:val="22"/>
         </w:rPr>
         <w:t>5 - Vollständig korrekt:</w:t>
       </w:r>
       <w:r>
-        <w:rPr/>
+        <w:rPr>
+          <w:sz w:val="22"/>
+          <w:szCs w:val="22"/>
+        </w:rPr>
         <w:t xml:space="preserve"> Alle Aussagen entsprechen dem Textinhalt</w:t>
       </w:r>
     </w:p>
@@ -2210,10 +2632,16 @@
         </w:numPr>
         <w:bidi w:val="0"/>
         <w:jc w:val="start"/>
-        <w:rPr/>
-      </w:pPr>
-      <w:r>
-        <w:rPr/>
+        <w:rPr>
+          <w:sz w:val="22"/>
+          <w:szCs w:val="22"/>
+        </w:rPr>
+      </w:pPr>
+      <w:r>
+        <w:rPr>
+          <w:sz w:val="22"/>
+          <w:szCs w:val="22"/>
+        </w:rPr>
         <w:t>Bsp.: “Beschreiben Sie, wie der Network Layer die Kommunikation zwischen Geräten in unterschiedlichen Netzen ermöglicht.”</w:t>
       </w:r>
     </w:p>
@@ -2226,17 +2654,25 @@
         </w:numPr>
         <w:bidi w:val="0"/>
         <w:jc w:val="start"/>
-        <w:rPr/>
+        <w:rPr>
+          <w:sz w:val="22"/>
+          <w:szCs w:val="22"/>
+        </w:rPr>
       </w:pPr>
       <w:r>
         <w:rPr>
           <w:b/>
           <w:bCs/>
+          <w:sz w:val="22"/>
+          <w:szCs w:val="22"/>
         </w:rPr>
         <w:t>4 - Überwiegend korrekt:</w:t>
       </w:r>
       <w:r>
-        <w:rPr/>
+        <w:rPr>
+          <w:sz w:val="22"/>
+          <w:szCs w:val="22"/>
+        </w:rPr>
         <w:t xml:space="preserve"> Überwiegend korrekt, minimale Ungenauigkeiten</w:t>
       </w:r>
     </w:p>
@@ -2249,17 +2685,25 @@
         </w:numPr>
         <w:bidi w:val="0"/>
         <w:jc w:val="start"/>
-        <w:rPr/>
+        <w:rPr>
+          <w:sz w:val="22"/>
+          <w:szCs w:val="22"/>
+        </w:rPr>
       </w:pPr>
       <w:r>
         <w:rPr>
           <w:b/>
           <w:bCs/>
+          <w:sz w:val="22"/>
+          <w:szCs w:val="22"/>
         </w:rPr>
         <w:t>3 - Teilweise korrekt:</w:t>
       </w:r>
       <w:r>
-        <w:rPr/>
+        <w:rPr>
+          <w:sz w:val="22"/>
+          <w:szCs w:val="22"/>
+        </w:rPr>
         <w:t xml:space="preserve"> Erkennbare Ungenauigkeiten in der Frage</w:t>
       </w:r>
     </w:p>
@@ -2272,17 +2716,25 @@
         </w:numPr>
         <w:bidi w:val="0"/>
         <w:jc w:val="start"/>
-        <w:rPr/>
+        <w:rPr>
+          <w:sz w:val="22"/>
+          <w:szCs w:val="22"/>
+        </w:rPr>
       </w:pPr>
       <w:r>
         <w:rPr>
           <w:b/>
           <w:bCs/>
+          <w:sz w:val="22"/>
+          <w:szCs w:val="22"/>
         </w:rPr>
         <w:t>2 - Größtenteils inkorrekt:</w:t>
       </w:r>
       <w:r>
-        <w:rPr/>
+        <w:rPr>
+          <w:sz w:val="22"/>
+          <w:szCs w:val="22"/>
+        </w:rPr>
         <w:t xml:space="preserve"> Mehrere falsche Aussagen oder Missverständnisse</w:t>
       </w:r>
     </w:p>
@@ -2295,17 +2747,25 @@
         </w:numPr>
         <w:bidi w:val="0"/>
         <w:jc w:val="start"/>
-        <w:rPr/>
+        <w:rPr>
+          <w:sz w:val="22"/>
+          <w:szCs w:val="22"/>
+        </w:rPr>
       </w:pPr>
       <w:r>
         <w:rPr>
           <w:b/>
           <w:bCs/>
+          <w:sz w:val="22"/>
+          <w:szCs w:val="22"/>
         </w:rPr>
         <w:t>1 - Völlig inkorrekt:</w:t>
       </w:r>
       <w:r>
-        <w:rPr/>
+        <w:rPr>
+          <w:sz w:val="22"/>
+          <w:szCs w:val="22"/>
+        </w:rPr>
         <w:t xml:space="preserve"> Frage enthält grundlegend falsche Behauptungen</w:t>
       </w:r>
     </w:p>
@@ -2318,12 +2778,18 @@
         </w:numPr>
         <w:bidi w:val="0"/>
         <w:jc w:val="start"/>
-        <w:rPr/>
+        <w:rPr>
+          <w:sz w:val="22"/>
+          <w:szCs w:val="22"/>
+        </w:rPr>
       </w:pPr>
       <w:bookmarkStart w:id="13" w:name="X5adecf790d361ef61a0e462edd7ab013df4437a"/>
       <w:bookmarkStart w:id="14" w:name="korrektheitcorrectness"/>
       <w:r>
-        <w:rPr/>
+        <w:rPr>
+          <w:sz w:val="22"/>
+          <w:szCs w:val="22"/>
+        </w:rPr>
         <w:t>Bsp.: “Warum ist der Physical Layer für die Verschlüsselung von Daten zuständig?”</w:t>
       </w:r>
       <w:bookmarkEnd w:id="13"/>
@@ -2397,160 +2863,6 @@
     </w:p>
     <w:p>
       <w:pPr>
-        <w:pStyle w:val="Compact"/>
-        <w:bidi w:val="0"/>
-        <w:jc w:val="start"/>
-        <w:rPr/>
-      </w:pPr>
-      <w:r>
-        <w:rPr/>
-      </w:r>
-    </w:p>
-    <w:p>
-      <w:pPr>
-        <w:pStyle w:val="Compact"/>
-        <w:bidi w:val="0"/>
-        <w:jc w:val="start"/>
-        <w:rPr/>
-      </w:pPr>
-      <w:r>
-        <w:rPr/>
-      </w:r>
-    </w:p>
-    <w:p>
-      <w:pPr>
-        <w:pStyle w:val="Compact"/>
-        <w:bidi w:val="0"/>
-        <w:jc w:val="start"/>
-        <w:rPr/>
-      </w:pPr>
-      <w:r>
-        <w:rPr/>
-      </w:r>
-    </w:p>
-    <w:p>
-      <w:pPr>
-        <w:pStyle w:val="Compact"/>
-        <w:bidi w:val="0"/>
-        <w:jc w:val="start"/>
-        <w:rPr/>
-      </w:pPr>
-      <w:r>
-        <w:rPr/>
-      </w:r>
-    </w:p>
-    <w:p>
-      <w:pPr>
-        <w:pStyle w:val="Compact"/>
-        <w:bidi w:val="0"/>
-        <w:jc w:val="start"/>
-        <w:rPr/>
-      </w:pPr>
-      <w:r>
-        <w:rPr/>
-      </w:r>
-    </w:p>
-    <w:p>
-      <w:pPr>
-        <w:pStyle w:val="Compact"/>
-        <w:bidi w:val="0"/>
-        <w:jc w:val="start"/>
-        <w:rPr/>
-      </w:pPr>
-      <w:r>
-        <w:rPr/>
-      </w:r>
-    </w:p>
-    <w:p>
-      <w:pPr>
-        <w:pStyle w:val="Compact"/>
-        <w:bidi w:val="0"/>
-        <w:jc w:val="start"/>
-        <w:rPr/>
-      </w:pPr>
-      <w:r>
-        <w:rPr/>
-      </w:r>
-    </w:p>
-    <w:p>
-      <w:pPr>
-        <w:pStyle w:val="Compact"/>
-        <w:bidi w:val="0"/>
-        <w:jc w:val="start"/>
-        <w:rPr/>
-      </w:pPr>
-      <w:r>
-        <w:rPr/>
-      </w:r>
-    </w:p>
-    <w:p>
-      <w:pPr>
-        <w:pStyle w:val="Compact"/>
-        <w:bidi w:val="0"/>
-        <w:jc w:val="start"/>
-        <w:rPr/>
-      </w:pPr>
-      <w:r>
-        <w:rPr/>
-      </w:r>
-    </w:p>
-    <w:p>
-      <w:pPr>
-        <w:pStyle w:val="Compact"/>
-        <w:bidi w:val="0"/>
-        <w:jc w:val="start"/>
-        <w:rPr/>
-      </w:pPr>
-      <w:r>
-        <w:rPr/>
-      </w:r>
-    </w:p>
-    <w:p>
-      <w:pPr>
-        <w:pStyle w:val="Compact"/>
-        <w:bidi w:val="0"/>
-        <w:jc w:val="start"/>
-        <w:rPr/>
-      </w:pPr>
-      <w:r>
-        <w:rPr/>
-      </w:r>
-    </w:p>
-    <w:p>
-      <w:pPr>
-        <w:pStyle w:val="Compact"/>
-        <w:bidi w:val="0"/>
-        <w:jc w:val="start"/>
-        <w:rPr/>
-      </w:pPr>
-      <w:r>
-        <w:rPr/>
-      </w:r>
-    </w:p>
-    <w:p>
-      <w:pPr>
-        <w:pStyle w:val="Compact"/>
-        <w:bidi w:val="0"/>
-        <w:jc w:val="start"/>
-        <w:rPr/>
-      </w:pPr>
-      <w:r>
-        <w:rPr/>
-      </w:r>
-    </w:p>
-    <w:p>
-      <w:pPr>
-        <w:pStyle w:val="Compact"/>
-        <w:bidi w:val="0"/>
-        <w:jc w:val="start"/>
-        <w:rPr/>
-      </w:pPr>
-      <w:r>
-        <w:rPr/>
-      </w:r>
-    </w:p>
-    <w:p>
-      <w:pPr>
         <w:pStyle w:val="Heading2"/>
         <w:bidi w:val="0"/>
         <w:jc w:val="start"/>
@@ -2578,11 +2890,17 @@
         <w:pStyle w:val="FirstParagraph"/>
         <w:bidi w:val="0"/>
         <w:jc w:val="start"/>
-        <w:rPr/>
+        <w:rPr>
+          <w:sz w:val="22"/>
+          <w:szCs w:val="22"/>
+        </w:rPr>
       </w:pPr>
       <w:bookmarkStart w:id="15" w:name="lernziel"/>
       <w:r>
-        <w:rPr/>
+        <w:rPr>
+          <w:sz w:val="22"/>
+          <w:szCs w:val="22"/>
+        </w:rPr>
         <w:t>Die Studierenden beherrschen das Sitzungskonzept, einschließlich Sitzungsverwaltung, Synchronisation und Bündelung von Transaktionen</w:t>
       </w:r>
       <w:bookmarkEnd w:id="15"/>
@@ -2604,10 +2922,16 @@
         <w:pStyle w:val="FirstParagraph"/>
         <w:bidi w:val="0"/>
         <w:jc w:val="start"/>
-        <w:rPr/>
-      </w:pPr>
-      <w:r>
-        <w:rPr/>
+        <w:rPr>
+          <w:sz w:val="22"/>
+          <w:szCs w:val="22"/>
+        </w:rPr>
+      </w:pPr>
+      <w:r>
+        <w:rPr>
+          <w:sz w:val="22"/>
+          <w:szCs w:val="22"/>
+        </w:rPr>
         <w:t>Frage: Welche zwei Beschreibungen erklären korrekt die Kernaufgaben des Session Layers im Rahmen des Sitzungskonzepts einer Kommunikationsbeziehung?</w:t>
       </w:r>
     </w:p>
@@ -2616,10 +2940,16 @@
         <w:pStyle w:val="BodyText"/>
         <w:bidi w:val="0"/>
         <w:jc w:val="start"/>
-        <w:rPr/>
-      </w:pPr>
-      <w:r>
-        <w:rPr/>
+        <w:rPr>
+          <w:sz w:val="22"/>
+          <w:szCs w:val="22"/>
+        </w:rPr>
+      </w:pPr>
+      <w:r>
+        <w:rPr>
+          <w:sz w:val="22"/>
+          <w:szCs w:val="22"/>
+        </w:rPr>
         <w:t>Antwortmöglichkeiten:</w:t>
       </w:r>
     </w:p>
@@ -2632,10 +2962,16 @@
         </w:numPr>
         <w:bidi w:val="0"/>
         <w:jc w:val="start"/>
-        <w:rPr/>
-      </w:pPr>
-      <w:r>
-        <w:rPr/>
+        <w:rPr>
+          <w:sz w:val="22"/>
+          <w:szCs w:val="22"/>
+        </w:rPr>
+      </w:pPr>
+      <w:r>
+        <w:rPr>
+          <w:sz w:val="22"/>
+          <w:szCs w:val="22"/>
+        </w:rPr>
         <w:t>Der Session Layer ermöglicht die Synchronisation durch das Setzen von Zwischenpunkten sowie die Bündelung zusammengehöriger Transaktionen zu Gruppen. (Richtig)</w:t>
       </w:r>
     </w:p>
@@ -2644,14 +2980,20 @@
         <w:pStyle w:val="Compact"/>
         <w:numPr>
           <w:ilvl w:val="0"/>
-          <w:numId w:val="1"/>
-        </w:numPr>
-        <w:bidi w:val="0"/>
-        <w:jc w:val="start"/>
-        <w:rPr/>
-      </w:pPr>
-      <w:r>
-        <w:rPr/>
+          <w:numId w:val="10"/>
+        </w:numPr>
+        <w:bidi w:val="0"/>
+        <w:jc w:val="start"/>
+        <w:rPr>
+          <w:sz w:val="22"/>
+          <w:szCs w:val="22"/>
+        </w:rPr>
+      </w:pPr>
+      <w:r>
+        <w:rPr>
+          <w:sz w:val="22"/>
+          <w:szCs w:val="22"/>
+        </w:rPr>
         <w:t>Der Session Layer gewährleistet die zuverlässige Ende-zu-Ende-Übertragung durch Flusskontrolle und Segmentierung der Datenströme. (Falsch)</w:t>
       </w:r>
     </w:p>
@@ -2660,14 +3002,20 @@
         <w:pStyle w:val="Compact"/>
         <w:numPr>
           <w:ilvl w:val="0"/>
-          <w:numId w:val="1"/>
-        </w:numPr>
-        <w:bidi w:val="0"/>
-        <w:jc w:val="start"/>
-        <w:rPr/>
-      </w:pPr>
-      <w:r>
-        <w:rPr/>
+          <w:numId w:val="11"/>
+        </w:numPr>
+        <w:bidi w:val="0"/>
+        <w:jc w:val="start"/>
+        <w:rPr>
+          <w:sz w:val="22"/>
+          <w:szCs w:val="22"/>
+        </w:rPr>
+      </w:pPr>
+      <w:r>
+        <w:rPr>
+          <w:sz w:val="22"/>
+          <w:szCs w:val="22"/>
+        </w:rPr>
         <w:t>Der Session Layer ist für das Aufbauen, Verwalten, Zurückweisen und Beenden von Sitzungen innerhalb einer Kommunikationsbeziehung zuständig. (Richtig)</w:t>
       </w:r>
     </w:p>
@@ -2676,15 +3024,21 @@
         <w:pStyle w:val="Compact"/>
         <w:numPr>
           <w:ilvl w:val="0"/>
-          <w:numId w:val="1"/>
-        </w:numPr>
-        <w:bidi w:val="0"/>
-        <w:jc w:val="start"/>
-        <w:rPr/>
+          <w:numId w:val="12"/>
+        </w:numPr>
+        <w:bidi w:val="0"/>
+        <w:jc w:val="start"/>
+        <w:rPr>
+          <w:sz w:val="22"/>
+          <w:szCs w:val="22"/>
+        </w:rPr>
       </w:pPr>
       <w:bookmarkStart w:id="16" w:name="formulierte-frage"/>
       <w:r>
-        <w:rPr/>
+        <w:rPr>
+          <w:sz w:val="22"/>
+          <w:szCs w:val="22"/>
+        </w:rPr>
         <w:t>Der Session Layer ist für die Datenkomprimierung und die Konvertierung von Datenformaten zwischen unterschiedlichen Systemen zuständig. (Falsch)</w:t>
       </w:r>
       <w:bookmarkEnd w:id="16"/>
@@ -2706,10 +3060,16 @@
         <w:pStyle w:val="FirstParagraph"/>
         <w:bidi w:val="0"/>
         <w:jc w:val="start"/>
-        <w:rPr/>
-      </w:pPr>
-      <w:r>
-        <w:rPr/>
+        <w:rPr>
+          <w:sz w:val="22"/>
+          <w:szCs w:val="22"/>
+        </w:rPr>
+      </w:pPr>
+      <w:r>
+        <w:rPr>
+          <w:sz w:val="22"/>
+          <w:szCs w:val="22"/>
+        </w:rPr>
         <w:t>Session Layer 5</w:t>
       </w:r>
     </w:p>
@@ -2718,11 +3078,19 @@
         <w:pStyle w:val="BodyText"/>
         <w:bidi w:val="0"/>
         <w:jc w:val="start"/>
-        <w:rPr/>
-      </w:pPr>
-      <w:r>
-        <w:rPr/>
-        <w:t>Beschreibung Bereitstellung der Funktionen für das Sitzungs(Session)-Konzept einer Kommunikationsbeziehung.</w:t>
+        <w:rPr>
+          <w:sz w:val="22"/>
+          <w:szCs w:val="22"/>
+        </w:rPr>
+      </w:pPr>
+      <w:r>
+        <w:rPr>
+          <w:sz w:val="22"/>
+          <w:szCs w:val="22"/>
+        </w:rPr>
+        <w:t xml:space="preserve">Beschreibung </w:t>
+        <w:br/>
+        <w:t>Bereitstellung der Funktionen für das Sitzungs(Session)-Konzept einer Kommunikationsbeziehung.</w:t>
       </w:r>
     </w:p>
     <w:p>
@@ -2730,10 +3098,16 @@
         <w:pStyle w:val="BodyText"/>
         <w:bidi w:val="0"/>
         <w:jc w:val="start"/>
-        <w:rPr/>
-      </w:pPr>
-      <w:r>
-        <w:rPr/>
+        <w:rPr>
+          <w:sz w:val="22"/>
+          <w:szCs w:val="22"/>
+        </w:rPr>
+      </w:pPr>
+      <w:r>
+        <w:rPr>
+          <w:sz w:val="22"/>
+          <w:szCs w:val="22"/>
+        </w:rPr>
         <w:t>3 Kernaufgaben</w:t>
       </w:r>
     </w:p>
@@ -2742,10 +3116,16 @@
         <w:pStyle w:val="BodyText"/>
         <w:bidi w:val="0"/>
         <w:jc w:val="start"/>
-        <w:rPr/>
-      </w:pPr>
-      <w:r>
-        <w:rPr/>
+        <w:rPr>
+          <w:sz w:val="22"/>
+          <w:szCs w:val="22"/>
+        </w:rPr>
+      </w:pPr>
+      <w:r>
+        <w:rPr>
+          <w:sz w:val="22"/>
+          <w:szCs w:val="22"/>
+        </w:rPr>
         <w:t>Sitzungen:</w:t>
       </w:r>
     </w:p>
@@ -2754,10 +3134,16 @@
         <w:pStyle w:val="BodyText"/>
         <w:bidi w:val="0"/>
         <w:jc w:val="start"/>
-        <w:rPr/>
-      </w:pPr>
-      <w:r>
-        <w:rPr/>
+        <w:rPr>
+          <w:sz w:val="22"/>
+          <w:szCs w:val="22"/>
+        </w:rPr>
+      </w:pPr>
+      <w:r>
+        <w:rPr>
+          <w:sz w:val="22"/>
+          <w:szCs w:val="22"/>
+        </w:rPr>
         <w:t>Aufbauen, verwalten, zurückweisen und beenden.</w:t>
       </w:r>
     </w:p>
@@ -2766,10 +3152,16 @@
         <w:pStyle w:val="BodyText"/>
         <w:bidi w:val="0"/>
         <w:jc w:val="start"/>
-        <w:rPr/>
-      </w:pPr>
-      <w:r>
-        <w:rPr/>
+        <w:rPr>
+          <w:sz w:val="22"/>
+          <w:szCs w:val="22"/>
+        </w:rPr>
+      </w:pPr>
+      <w:r>
+        <w:rPr>
+          <w:sz w:val="22"/>
+          <w:szCs w:val="22"/>
+        </w:rPr>
         <w:t>Synchronisation:</w:t>
       </w:r>
     </w:p>
@@ -2778,10 +3170,16 @@
         <w:pStyle w:val="BodyText"/>
         <w:bidi w:val="0"/>
         <w:jc w:val="start"/>
-        <w:rPr/>
-      </w:pPr>
-      <w:r>
-        <w:rPr/>
+        <w:rPr>
+          <w:sz w:val="22"/>
+          <w:szCs w:val="22"/>
+        </w:rPr>
+      </w:pPr>
+      <w:r>
+        <w:rPr>
+          <w:sz w:val="22"/>
+          <w:szCs w:val="22"/>
+        </w:rPr>
         <w:t>Setzen von Zwischenpunkten.</w:t>
       </w:r>
     </w:p>
@@ -2790,10 +3188,16 @@
         <w:pStyle w:val="BodyText"/>
         <w:bidi w:val="0"/>
         <w:jc w:val="start"/>
-        <w:rPr/>
-      </w:pPr>
-      <w:r>
-        <w:rPr/>
+        <w:rPr>
+          <w:sz w:val="22"/>
+          <w:szCs w:val="22"/>
+        </w:rPr>
+      </w:pPr>
+      <w:r>
+        <w:rPr>
+          <w:sz w:val="22"/>
+          <w:szCs w:val="22"/>
+        </w:rPr>
         <w:t>Bündelung</w:t>
       </w:r>
     </w:p>
@@ -2807,22 +3211,14 @@
       <w:bookmarkStart w:id="17" w:name="multiple-choice-question"/>
       <w:bookmarkStart w:id="18" w:name="quelltext"/>
       <w:r>
-        <w:rPr/>
+        <w:rPr>
+          <w:sz w:val="22"/>
+          <w:szCs w:val="22"/>
+        </w:rPr>
         <w:t>Gruppierung zusammengehöriger Transaktionen.</w:t>
       </w:r>
       <w:bookmarkEnd w:id="17"/>
       <w:bookmarkEnd w:id="18"/>
-    </w:p>
-    <w:p>
-      <w:pPr>
-        <w:pStyle w:val="BodyText"/>
-        <w:bidi w:val="0"/>
-        <w:jc w:val="start"/>
-        <w:rPr/>
-      </w:pPr>
-      <w:r>
-        <w:rPr/>
-      </w:r>
     </w:p>
     <w:tbl>
       <w:tblPr>
@@ -3540,6 +3936,28 @@
     </w:p>
     <w:p>
       <w:pPr>
+        <w:pStyle w:val="BodyText"/>
+        <w:bidi w:val="0"/>
+        <w:jc w:val="start"/>
+        <w:rPr/>
+      </w:pPr>
+      <w:r>
+        <w:rPr/>
+      </w:r>
+    </w:p>
+    <w:p>
+      <w:pPr>
+        <w:pStyle w:val="BodyText"/>
+        <w:bidi w:val="0"/>
+        <w:jc w:val="start"/>
+        <w:rPr/>
+      </w:pPr>
+      <w:r>
+        <w:rPr/>
+      </w:r>
+    </w:p>
+    <w:p>
+      <w:pPr>
         <w:pStyle w:val="Heading2"/>
         <w:bidi w:val="0"/>
         <w:jc w:val="start"/>
@@ -3567,11 +3985,17 @@
         <w:pStyle w:val="FirstParagraph"/>
         <w:bidi w:val="0"/>
         <w:jc w:val="start"/>
-        <w:rPr/>
+        <w:rPr>
+          <w:sz w:val="22"/>
+          <w:szCs w:val="22"/>
+        </w:rPr>
       </w:pPr>
       <w:bookmarkStart w:id="19" w:name="lernziel_Copy_1"/>
       <w:r>
-        <w:rPr/>
+        <w:rPr>
+          <w:sz w:val="22"/>
+          <w:szCs w:val="22"/>
+        </w:rPr>
         <w:t>Die Studierenden beherrschen die Mechanismen zur fehlergesicherten Datenübertragung, einschließlich Fehlerkontrolle, Flusskontrolle, Segmentierung, Identifikation und Medienzugriff</w:t>
       </w:r>
       <w:bookmarkEnd w:id="19"/>
@@ -3593,10 +4017,16 @@
         <w:pStyle w:val="FirstParagraph"/>
         <w:bidi w:val="0"/>
         <w:jc w:val="start"/>
-        <w:rPr/>
-      </w:pPr>
-      <w:r>
-        <w:rPr/>
+        <w:rPr>
+          <w:sz w:val="22"/>
+          <w:szCs w:val="22"/>
+        </w:rPr>
+      </w:pPr>
+      <w:r>
+        <w:rPr>
+          <w:sz w:val="22"/>
+          <w:szCs w:val="22"/>
+        </w:rPr>
         <w:t>Frage: Beurteilen Sie, welche der fünf Kernaufgaben des Data Link Layer den größten Beitrag zur Gewährleistung einer fehlergesicherten Übertragung über einen nicht fehlergesicherten Physical Layer leistet, und begründen Sie Ihre Einschätzung anhand der jeweiligen Funktionen.</w:t>
       </w:r>
     </w:p>
@@ -3605,11 +4035,17 @@
         <w:pStyle w:val="BodyText"/>
         <w:bidi w:val="0"/>
         <w:jc w:val="start"/>
-        <w:rPr/>
+        <w:rPr>
+          <w:sz w:val="22"/>
+          <w:szCs w:val="22"/>
+        </w:rPr>
       </w:pPr>
       <w:bookmarkStart w:id="20" w:name="formulierte-frage_Copy_1"/>
       <w:r>
-        <w:rPr/>
+        <w:rPr>
+          <w:sz w:val="22"/>
+          <w:szCs w:val="22"/>
+        </w:rPr>
         <w:t>Antwort: Die Fehlerkontrolle leistet den größten Beitrag zur fehlergesicherten Übertragung. Sie adressiert direkt das Kernproblem des nicht fehlergesicherten Physical Layers, indem sie Übertragungsfehler erkennt, behebt oder signalisiert. Die anderen vier Aufgaben unterstützen zwar die Kommunikation, zielen jedoch nicht primär auf Fehlersicherung ab: Die Flusskontrolle regelt lediglich Geschwindigkeitsunterschiede zwischen Sender und Empfänger. Die Segmentierung strukturiert Bitströme zu handhabbaren Einheiten. Die Identifikation ermöglicht Adressierung von Kommunikationspartnern. Der Medienzugriff koordiniert die Nutzung des Physical Layers. Nur die Fehlerkontrolle kompensiert aktiv die Unzuverlässigkeit des Physical Layers und transformiert damit eine unsichere in eine sichere Verbindung, was der zentralen Beschreibung des Data Link Layers entspricht. (Richtig)</w:t>
       </w:r>
       <w:bookmarkEnd w:id="20"/>
@@ -3631,11 +4067,37 @@
         <w:pStyle w:val="FirstParagraph"/>
         <w:bidi w:val="0"/>
         <w:jc w:val="start"/>
-        <w:rPr/>
-      </w:pPr>
-      <w:r>
-        <w:rPr/>
-        <w:t>Data Link Layer 2 Beschreibung Bereitstellung einer fehlergesicherten Übertragung über einen möglicherweise nicht fehlergesicherten Physical Layer.</w:t>
+        <w:rPr>
+          <w:sz w:val="22"/>
+          <w:szCs w:val="22"/>
+        </w:rPr>
+      </w:pPr>
+      <w:r>
+        <w:rPr>
+          <w:sz w:val="22"/>
+          <w:szCs w:val="22"/>
+        </w:rPr>
+        <w:t xml:space="preserve">Data Link Layer 2 </w:t>
+      </w:r>
+    </w:p>
+    <w:p>
+      <w:pPr>
+        <w:pStyle w:val="FirstParagraph"/>
+        <w:bidi w:val="0"/>
+        <w:jc w:val="start"/>
+        <w:rPr>
+          <w:sz w:val="22"/>
+          <w:szCs w:val="22"/>
+        </w:rPr>
+      </w:pPr>
+      <w:r>
+        <w:rPr>
+          <w:sz w:val="22"/>
+          <w:szCs w:val="22"/>
+        </w:rPr>
+        <w:t xml:space="preserve">Beschreibung </w:t>
+        <w:br/>
+        <w:t>Bereitstellung einer fehlergesicherten Übertragung über einen möglicherweise nicht fehlergesicherten Physical Layer.</w:t>
       </w:r>
     </w:p>
     <w:p>
@@ -3643,10 +4105,16 @@
         <w:pStyle w:val="BodyText"/>
         <w:bidi w:val="0"/>
         <w:jc w:val="start"/>
-        <w:rPr/>
-      </w:pPr>
-      <w:r>
-        <w:rPr/>
+        <w:rPr>
+          <w:sz w:val="22"/>
+          <w:szCs w:val="22"/>
+        </w:rPr>
+      </w:pPr>
+      <w:r>
+        <w:rPr>
+          <w:sz w:val="22"/>
+          <w:szCs w:val="22"/>
+        </w:rPr>
         <w:t>5 Kernaufgaben</w:t>
       </w:r>
     </w:p>
@@ -3655,10 +4123,16 @@
         <w:pStyle w:val="BodyText"/>
         <w:bidi w:val="0"/>
         <w:jc w:val="start"/>
-        <w:rPr/>
-      </w:pPr>
-      <w:r>
-        <w:rPr/>
+        <w:rPr>
+          <w:sz w:val="22"/>
+          <w:szCs w:val="22"/>
+        </w:rPr>
+      </w:pPr>
+      <w:r>
+        <w:rPr>
+          <w:sz w:val="22"/>
+          <w:szCs w:val="22"/>
+        </w:rPr>
         <w:t>Fehlerkontrolle:</w:t>
       </w:r>
     </w:p>
@@ -3667,10 +4141,16 @@
         <w:pStyle w:val="BodyText"/>
         <w:bidi w:val="0"/>
         <w:jc w:val="start"/>
-        <w:rPr/>
-      </w:pPr>
-      <w:r>
-        <w:rPr/>
+        <w:rPr>
+          <w:sz w:val="22"/>
+          <w:szCs w:val="22"/>
+        </w:rPr>
+      </w:pPr>
+      <w:r>
+        <w:rPr>
+          <w:sz w:val="22"/>
+          <w:szCs w:val="22"/>
+        </w:rPr>
         <w:t>Erkennen, Beheben oder Signalisieren von Übertragungsfehlern.</w:t>
       </w:r>
     </w:p>
@@ -3679,10 +4159,16 @@
         <w:pStyle w:val="BodyText"/>
         <w:bidi w:val="0"/>
         <w:jc w:val="start"/>
-        <w:rPr/>
-      </w:pPr>
-      <w:r>
-        <w:rPr/>
+        <w:rPr>
+          <w:sz w:val="22"/>
+          <w:szCs w:val="22"/>
+        </w:rPr>
+      </w:pPr>
+      <w:r>
+        <w:rPr>
+          <w:sz w:val="22"/>
+          <w:szCs w:val="22"/>
+        </w:rPr>
         <w:t>Flußkontrolle:</w:t>
       </w:r>
     </w:p>
@@ -3691,10 +4177,16 @@
         <w:pStyle w:val="BodyText"/>
         <w:bidi w:val="0"/>
         <w:jc w:val="start"/>
-        <w:rPr/>
-      </w:pPr>
-      <w:r>
-        <w:rPr/>
+        <w:rPr>
+          <w:sz w:val="22"/>
+          <w:szCs w:val="22"/>
+        </w:rPr>
+      </w:pPr>
+      <w:r>
+        <w:rPr>
+          <w:sz w:val="22"/>
+          <w:szCs w:val="22"/>
+        </w:rPr>
         <w:t>Strategien, wenn Sender für Empfänger zu schnell sendet. Bsp: Zwischenpuffern, Herunterregeln, warten Lassen.</w:t>
       </w:r>
     </w:p>
@@ -3703,10 +4195,33 @@
         <w:pStyle w:val="BodyText"/>
         <w:bidi w:val="0"/>
         <w:jc w:val="start"/>
-        <w:rPr/>
-      </w:pPr>
-      <w:r>
-        <w:rPr/>
+        <w:rPr>
+          <w:sz w:val="22"/>
+          <w:szCs w:val="22"/>
+        </w:rPr>
+      </w:pPr>
+      <w:r>
+        <w:rPr>
+          <w:sz w:val="22"/>
+          <w:szCs w:val="22"/>
+        </w:rPr>
+      </w:r>
+    </w:p>
+    <w:p>
+      <w:pPr>
+        <w:pStyle w:val="BodyText"/>
+        <w:bidi w:val="0"/>
+        <w:jc w:val="start"/>
+        <w:rPr>
+          <w:sz w:val="22"/>
+          <w:szCs w:val="22"/>
+        </w:rPr>
+      </w:pPr>
+      <w:r>
+        <w:rPr>
+          <w:sz w:val="22"/>
+          <w:szCs w:val="22"/>
+        </w:rPr>
         <w:t>Segmentierung:</w:t>
       </w:r>
     </w:p>
@@ -3715,10 +4230,16 @@
         <w:pStyle w:val="BodyText"/>
         <w:bidi w:val="0"/>
         <w:jc w:val="start"/>
-        <w:rPr/>
-      </w:pPr>
-      <w:r>
-        <w:rPr/>
+        <w:rPr>
+          <w:sz w:val="22"/>
+          <w:szCs w:val="22"/>
+        </w:rPr>
+      </w:pPr>
+      <w:r>
+        <w:rPr>
+          <w:sz w:val="22"/>
+          <w:szCs w:val="22"/>
+        </w:rPr>
         <w:t>Zusammenfassen einzelner Bits zu größeren Einheiten. Universal-typisches Bsp: 8-bit Bytes.</w:t>
       </w:r>
     </w:p>
@@ -3727,10 +4248,16 @@
         <w:pStyle w:val="BodyText"/>
         <w:bidi w:val="0"/>
         <w:jc w:val="start"/>
-        <w:rPr/>
-      </w:pPr>
-      <w:r>
-        <w:rPr/>
+        <w:rPr>
+          <w:sz w:val="22"/>
+          <w:szCs w:val="22"/>
+        </w:rPr>
+      </w:pPr>
+      <w:r>
+        <w:rPr>
+          <w:sz w:val="22"/>
+          <w:szCs w:val="22"/>
+        </w:rPr>
         <w:t>Identifikation:</w:t>
       </w:r>
     </w:p>
@@ -3739,10 +4266,16 @@
         <w:pStyle w:val="BodyText"/>
         <w:bidi w:val="0"/>
         <w:jc w:val="start"/>
-        <w:rPr/>
-      </w:pPr>
-      <w:r>
-        <w:rPr/>
+        <w:rPr>
+          <w:sz w:val="22"/>
+          <w:szCs w:val="22"/>
+        </w:rPr>
+      </w:pPr>
+      <w:r>
+        <w:rPr>
+          <w:sz w:val="22"/>
+          <w:szCs w:val="22"/>
+        </w:rPr>
         <w:t>Auswahl bestimmter Sender oder Empfänger (sog. Adresse).</w:t>
       </w:r>
     </w:p>
@@ -3751,10 +4284,16 @@
         <w:pStyle w:val="BodyText"/>
         <w:bidi w:val="0"/>
         <w:jc w:val="start"/>
-        <w:rPr/>
-      </w:pPr>
-      <w:r>
-        <w:rPr/>
+        <w:rPr>
+          <w:sz w:val="22"/>
+          <w:szCs w:val="22"/>
+        </w:rPr>
+      </w:pPr>
+      <w:r>
+        <w:rPr>
+          <w:sz w:val="22"/>
+          <w:szCs w:val="22"/>
+        </w:rPr>
         <w:t>Medienzugriff:</w:t>
       </w:r>
     </w:p>
@@ -3763,16 +4302,39 @@
         <w:pStyle w:val="BodyText"/>
         <w:bidi w:val="0"/>
         <w:jc w:val="start"/>
-        <w:rPr/>
+        <w:rPr>
+          <w:sz w:val="22"/>
+          <w:szCs w:val="22"/>
+        </w:rPr>
       </w:pPr>
       <w:bookmarkStart w:id="21" w:name="open-ended-question"/>
       <w:bookmarkStart w:id="22" w:name="quelltext_Copy_1"/>
       <w:r>
-        <w:rPr/>
+        <w:rPr>
+          <w:sz w:val="22"/>
+          <w:szCs w:val="22"/>
+        </w:rPr>
         <w:t>Aktivieren des Physical Layer. 4 typische Aspekte: Senden, Warten, Beheben und Reservieren.</w:t>
       </w:r>
       <w:bookmarkEnd w:id="21"/>
       <w:bookmarkEnd w:id="22"/>
+    </w:p>
+    <w:p>
+      <w:pPr>
+        <w:pStyle w:val="BodyText"/>
+        <w:bidi w:val="0"/>
+        <w:jc w:val="start"/>
+        <w:rPr>
+          <w:sz w:val="22"/>
+          <w:szCs w:val="22"/>
+        </w:rPr>
+      </w:pPr>
+      <w:r>
+        <w:rPr>
+          <w:sz w:val="22"/>
+          <w:szCs w:val="22"/>
+        </w:rPr>
+      </w:r>
     </w:p>
     <w:tbl>
       <w:tblPr>
@@ -4873,8 +5435,8 @@
   </w:abstractNum>
   <w:abstractNum w:abstractNumId="5">
     <w:lvl w:ilvl="0">
-      <w:numFmt w:val="bullet"/>
-      <w:lvlText w:val=""/>
+      <w:numFmt w:val="lowerLetter"/>
+      <w:lvlText w:val="%1)"/>
       <w:lvlJc w:val="start"/>
       <w:pPr>
         <w:tabs>
@@ -4882,9 +5444,6 @@
         </w:tabs>
         <w:ind w:start="720" w:hanging="360"/>
       </w:pPr>
-      <w:rPr>
-        <w:rFonts w:ascii="Symbol" w:hAnsi="Symbol" w:cs="Symbol" w:hint="default"/>
-      </w:rPr>
     </w:lvl>
     <w:lvl w:ilvl="1">
       <w:start w:val="0"/>
@@ -5334,7 +5893,66 @@
   <w:num w:numId="9">
     <w:abstractNumId w:val="1"/>
     <w:lvlOverride w:ilvl="0">
+      <w:lvl w:ilvl="0">
+        <w:numFmt w:val="lowerLetter"/>
+        <w:lvlText w:val="%1)"/>
+        <w:lvlJc w:val="start"/>
+        <w:pPr>
+          <w:tabs>
+            <w:tab w:val="num" w:pos="0"/>
+          </w:tabs>
+          <w:ind w:start="720" w:hanging="360"/>
+        </w:pPr>
+      </w:lvl>
       <w:startOverride w:val="1"/>
+    </w:lvlOverride>
+  </w:num>
+  <w:num w:numId="10">
+    <w:abstractNumId w:val="1"/>
+    <w:lvlOverride w:ilvl="0">
+      <w:lvl w:ilvl="0">
+        <w:numFmt w:val="lowerLetter"/>
+        <w:lvlText w:val="%1)"/>
+        <w:lvlJc w:val="start"/>
+        <w:pPr>
+          <w:tabs>
+            <w:tab w:val="num" w:pos="0"/>
+          </w:tabs>
+          <w:ind w:start="720" w:hanging="360"/>
+        </w:pPr>
+      </w:lvl>
+    </w:lvlOverride>
+  </w:num>
+  <w:num w:numId="11">
+    <w:abstractNumId w:val="1"/>
+    <w:lvlOverride w:ilvl="0">
+      <w:lvl w:ilvl="0">
+        <w:numFmt w:val="lowerLetter"/>
+        <w:lvlText w:val="%1)"/>
+        <w:lvlJc w:val="start"/>
+        <w:pPr>
+          <w:tabs>
+            <w:tab w:val="num" w:pos="0"/>
+          </w:tabs>
+          <w:ind w:start="720" w:hanging="360"/>
+        </w:pPr>
+      </w:lvl>
+    </w:lvlOverride>
+  </w:num>
+  <w:num w:numId="12">
+    <w:abstractNumId w:val="1"/>
+    <w:lvlOverride w:ilvl="0">
+      <w:lvl w:ilvl="0">
+        <w:numFmt w:val="lowerLetter"/>
+        <w:lvlText w:val="%1)"/>
+        <w:lvlJc w:val="start"/>
+        <w:pPr>
+          <w:tabs>
+            <w:tab w:val="num" w:pos="0"/>
+          </w:tabs>
+          <w:ind w:start="720" w:hanging="360"/>
+        </w:pPr>
+      </w:lvl>
     </w:lvlOverride>
   </w:num>
 </w:numbering>

</xml_diff>